<commit_message>
docs: formalize Compras/Importaciones v1.2 and ATC v1.1 business rules, update emails, reorganize workspace and create INDICE_DE_DOCUMENTACION
</commit_message>
<xml_diff>
--- a/requerimientos/compras_importaciones/REGLAS_DE_NEGOCIO_COMPRAS_IMPORTACIONES_FORMATEX.docx
+++ b/requerimientos/compras_importaciones/REGLAS_DE_NEGOCIO_COMPRAS_IMPORTACIONES_FORMATEX.docx
@@ -27,7 +27,7 @@
           <w:color w:val="0284C7"/>
           <w:sz w:val="24"/>
         </w:rPr>
-        <w:t>Módulo de Compras Internacionales, Importaciones &amp; Coordinación Inter-Compañía</w:t>
+        <w:t>Módulo de Compras Internacionales, Importaciones &amp; Sinergia Inter-Compañía</w:t>
         <w:br/>
         <w:t>(Telares y Tejidos S.A. de C.V. ↔ Forma Textil S. de R.L. de C.V.)</w:t>
       </w:r>
@@ -45,13 +45,13 @@
       <w:tr>
         <w:tc>
           <w:tcPr>
-            <w:tcW w:type="dxa" w:w="2880"/>
+            <w:tcW w:type="dxa" w:w="3168"/>
             <w:shd w:fill="F8FAFC"/>
             <w:tcMar>
-              <w:top w:w="60" w:type="dxa"/>
-              <w:bottom w:w="60" w:type="dxa"/>
-              <w:left w:w="100" w:type="dxa"/>
-              <w:right w:w="100" w:type="dxa"/>
+              <w:top w:w="50" w:type="dxa"/>
+              <w:bottom w:w="50" w:type="dxa"/>
+              <w:left w:w="80" w:type="dxa"/>
+              <w:right w:w="80" w:type="dxa"/>
             </w:tcMar>
           </w:tcPr>
           <w:p>
@@ -63,21 +63,21 @@
                 <w:rFonts w:ascii="Arial" w:hAnsi="Arial"/>
                 <w:b/>
                 <w:color w:val="1B365D"/>
-                <w:sz w:val="18"/>
+                <w:sz w:val="17"/>
               </w:rPr>
-              <w:t>Fecha de Levantamiento:</w:t>
+              <w:t>Fecha de Levantamiento &amp; Actualización:</w:t>
             </w:r>
           </w:p>
         </w:tc>
         <w:tc>
           <w:tcPr>
-            <w:tcW w:type="dxa" w:w="6480"/>
+            <w:tcW w:type="dxa" w:w="6192"/>
             <w:shd w:fill="FFFFFF"/>
             <w:tcMar>
-              <w:top w:w="60" w:type="dxa"/>
-              <w:bottom w:w="60" w:type="dxa"/>
-              <w:left w:w="100" w:type="dxa"/>
-              <w:right w:w="100" w:type="dxa"/>
+              <w:top w:w="50" w:type="dxa"/>
+              <w:bottom w:w="50" w:type="dxa"/>
+              <w:left w:w="80" w:type="dxa"/>
+              <w:right w:w="80" w:type="dxa"/>
             </w:tcMar>
           </w:tcPr>
           <w:p>
@@ -88,9 +88,9 @@
               <w:rPr>
                 <w:rFonts w:ascii="Arial" w:hAnsi="Arial"/>
                 <w:color w:val="334155"/>
-                <w:sz w:val="18"/>
+                <w:sz w:val="17"/>
               </w:rPr>
-              <w:t>Viernes, 16 de Octubre de 2026</w:t>
+              <w:t>Levantamiento: 16 de Octubre de 2026 | Consolidación Oficial: 21 de Octubre de 2026</w:t>
             </w:r>
           </w:p>
         </w:tc>
@@ -98,13 +98,13 @@
       <w:tr>
         <w:tc>
           <w:tcPr>
-            <w:tcW w:type="dxa" w:w="2880"/>
+            <w:tcW w:type="dxa" w:w="3168"/>
             <w:shd w:fill="F8FAFC"/>
             <w:tcMar>
-              <w:top w:w="60" w:type="dxa"/>
-              <w:bottom w:w="60" w:type="dxa"/>
-              <w:left w:w="100" w:type="dxa"/>
-              <w:right w:w="100" w:type="dxa"/>
+              <w:top w:w="50" w:type="dxa"/>
+              <w:bottom w:w="50" w:type="dxa"/>
+              <w:left w:w="80" w:type="dxa"/>
+              <w:right w:w="80" w:type="dxa"/>
             </w:tcMar>
           </w:tcPr>
           <w:p>
@@ -116,7 +116,7 @@
                 <w:rFonts w:ascii="Arial" w:hAnsi="Arial"/>
                 <w:b/>
                 <w:color w:val="1B365D"/>
-                <w:sz w:val="18"/>
+                <w:sz w:val="17"/>
               </w:rPr>
               <w:t>Organización:</w:t>
             </w:r>
@@ -124,13 +124,13 @@
         </w:tc>
         <w:tc>
           <w:tcPr>
-            <w:tcW w:type="dxa" w:w="6480"/>
+            <w:tcW w:type="dxa" w:w="6192"/>
             <w:shd w:fill="FFFFFF"/>
             <w:tcMar>
-              <w:top w:w="60" w:type="dxa"/>
-              <w:bottom w:w="60" w:type="dxa"/>
-              <w:left w:w="100" w:type="dxa"/>
-              <w:right w:w="100" w:type="dxa"/>
+              <w:top w:w="50" w:type="dxa"/>
+              <w:bottom w:w="50" w:type="dxa"/>
+              <w:left w:w="80" w:type="dxa"/>
+              <w:right w:w="80" w:type="dxa"/>
             </w:tcMar>
           </w:tcPr>
           <w:p>
@@ -141,9 +141,9 @@
               <w:rPr>
                 <w:rFonts w:ascii="Arial" w:hAnsi="Arial"/>
                 <w:color w:val="334155"/>
-                <w:sz w:val="18"/>
+                <w:sz w:val="17"/>
               </w:rPr>
-              <w:t>Forma Textil S. de R.L. de C.V. (Formatex) &amp; Telares y Tejidos (TNT)</w:t>
+              <w:t>Forma Textil S. de R.L. de C.V. (Formatex) &amp; Telares y Tejidos (Rensselaer / TNT)</w:t>
             </w:r>
           </w:p>
         </w:tc>
@@ -151,13 +151,13 @@
       <w:tr>
         <w:tc>
           <w:tcPr>
-            <w:tcW w:type="dxa" w:w="2880"/>
+            <w:tcW w:type="dxa" w:w="3168"/>
             <w:shd w:fill="F8FAFC"/>
             <w:tcMar>
-              <w:top w:w="60" w:type="dxa"/>
-              <w:bottom w:w="60" w:type="dxa"/>
-              <w:left w:w="100" w:type="dxa"/>
-              <w:right w:w="100" w:type="dxa"/>
+              <w:top w:w="50" w:type="dxa"/>
+              <w:bottom w:w="50" w:type="dxa"/>
+              <w:left w:w="80" w:type="dxa"/>
+              <w:right w:w="80" w:type="dxa"/>
             </w:tcMar>
           </w:tcPr>
           <w:p>
@@ -169,7 +169,7 @@
                 <w:rFonts w:ascii="Arial" w:hAnsi="Arial"/>
                 <w:b/>
                 <w:color w:val="1B365D"/>
-                <w:sz w:val="18"/>
+                <w:sz w:val="17"/>
               </w:rPr>
               <w:t>Proveedor Tecnológico:</w:t>
             </w:r>
@@ -177,13 +177,13 @@
         </w:tc>
         <w:tc>
           <w:tcPr>
-            <w:tcW w:type="dxa" w:w="6480"/>
+            <w:tcW w:type="dxa" w:w="6192"/>
             <w:shd w:fill="FFFFFF"/>
             <w:tcMar>
-              <w:top w:w="60" w:type="dxa"/>
-              <w:bottom w:w="60" w:type="dxa"/>
-              <w:left w:w="100" w:type="dxa"/>
-              <w:right w:w="100" w:type="dxa"/>
+              <w:top w:w="50" w:type="dxa"/>
+              <w:bottom w:w="50" w:type="dxa"/>
+              <w:left w:w="80" w:type="dxa"/>
+              <w:right w:w="80" w:type="dxa"/>
             </w:tcMar>
           </w:tcPr>
           <w:p>
@@ -194,7 +194,7 @@
               <w:rPr>
                 <w:rFonts w:ascii="Arial" w:hAnsi="Arial"/>
                 <w:color w:val="334155"/>
-                <w:sz w:val="18"/>
+                <w:sz w:val="17"/>
               </w:rPr>
               <w:t>Movida TCI LLC — Transformación Digital &amp; Ingeniería WMS</w:t>
             </w:r>
@@ -204,13 +204,13 @@
       <w:tr>
         <w:tc>
           <w:tcPr>
-            <w:tcW w:type="dxa" w:w="2880"/>
+            <w:tcW w:type="dxa" w:w="3168"/>
             <w:shd w:fill="F8FAFC"/>
             <w:tcMar>
-              <w:top w:w="60" w:type="dxa"/>
-              <w:bottom w:w="60" w:type="dxa"/>
-              <w:left w:w="100" w:type="dxa"/>
-              <w:right w:w="100" w:type="dxa"/>
+              <w:top w:w="50" w:type="dxa"/>
+              <w:bottom w:w="50" w:type="dxa"/>
+              <w:left w:w="80" w:type="dxa"/>
+              <w:right w:w="80" w:type="dxa"/>
             </w:tcMar>
           </w:tcPr>
           <w:p>
@@ -222,7 +222,7 @@
                 <w:rFonts w:ascii="Arial" w:hAnsi="Arial"/>
                 <w:b/>
                 <w:color w:val="1B365D"/>
-                <w:sz w:val="18"/>
+                <w:sz w:val="17"/>
               </w:rPr>
               <w:t>Versión del Documento:</w:t>
             </w:r>
@@ -230,13 +230,13 @@
         </w:tc>
         <w:tc>
           <w:tcPr>
-            <w:tcW w:type="dxa" w:w="6480"/>
+            <w:tcW w:type="dxa" w:w="6192"/>
             <w:shd w:fill="FFFFFF"/>
             <w:tcMar>
-              <w:top w:w="60" w:type="dxa"/>
-              <w:bottom w:w="60" w:type="dxa"/>
-              <w:left w:w="100" w:type="dxa"/>
-              <w:right w:w="100" w:type="dxa"/>
+              <w:top w:w="50" w:type="dxa"/>
+              <w:bottom w:w="50" w:type="dxa"/>
+              <w:left w:w="80" w:type="dxa"/>
+              <w:right w:w="80" w:type="dxa"/>
             </w:tcMar>
           </w:tcPr>
           <w:p>
@@ -247,9 +247,9 @@
               <w:rPr>
                 <w:rFonts w:ascii="Arial" w:hAnsi="Arial"/>
                 <w:color w:val="334155"/>
-                <w:sz w:val="18"/>
+                <w:sz w:val="17"/>
               </w:rPr>
-              <w:t>1.0 (Oficial para Revisión, Edición y Firma de Conformidad)</w:t>
+              <w:t>1.2 (Oficial Consolidada con Documentación Recibida y Preparación Fase 2)</w:t>
             </w:r>
           </w:p>
         </w:tc>
@@ -257,13 +257,13 @@
       <w:tr>
         <w:tc>
           <w:tcPr>
-            <w:tcW w:type="dxa" w:w="2880"/>
+            <w:tcW w:type="dxa" w:w="3168"/>
             <w:shd w:fill="F8FAFC"/>
             <w:tcMar>
-              <w:top w:w="60" w:type="dxa"/>
-              <w:bottom w:w="60" w:type="dxa"/>
-              <w:left w:w="100" w:type="dxa"/>
-              <w:right w:w="100" w:type="dxa"/>
+              <w:top w:w="50" w:type="dxa"/>
+              <w:bottom w:w="50" w:type="dxa"/>
+              <w:left w:w="80" w:type="dxa"/>
+              <w:right w:w="80" w:type="dxa"/>
             </w:tcMar>
           </w:tcPr>
           <w:p>
@@ -275,21 +275,21 @@
                 <w:rFonts w:ascii="Arial" w:hAnsi="Arial"/>
                 <w:b/>
                 <w:color w:val="1B365D"/>
-                <w:sz w:val="18"/>
+                <w:sz w:val="17"/>
               </w:rPr>
-              <w:t>Participantes en la Sesión:</w:t>
+              <w:t>Participantes Clave:</w:t>
             </w:r>
           </w:p>
         </w:tc>
         <w:tc>
           <w:tcPr>
-            <w:tcW w:type="dxa" w:w="6480"/>
+            <w:tcW w:type="dxa" w:w="6192"/>
             <w:shd w:fill="FFFFFF"/>
             <w:tcMar>
-              <w:top w:w="60" w:type="dxa"/>
-              <w:bottom w:w="60" w:type="dxa"/>
-              <w:left w:w="100" w:type="dxa"/>
-              <w:right w:w="100" w:type="dxa"/>
+              <w:top w:w="50" w:type="dxa"/>
+              <w:bottom w:w="50" w:type="dxa"/>
+              <w:left w:w="80" w:type="dxa"/>
+              <w:right w:w="80" w:type="dxa"/>
             </w:tcMar>
           </w:tcPr>
           <w:p>
@@ -300,13 +300,17 @@
               <w:rPr>
                 <w:rFonts w:ascii="Arial" w:hAnsi="Arial"/>
                 <w:color w:val="334155"/>
-                <w:sz w:val="18"/>
+                <w:sz w:val="17"/>
               </w:rPr>
-              <w:t>• Elba (Compras e Importaciones Formatex / TNT)</w:t>
+              <w:t>• Elba Vázquez (Compras &amp; Costeo de Importación Formatex / TNT)</w:t>
               <w:br/>
-              <w:t>• Mane (Especialista de Importaciones TNT)</w:t>
+              <w:t>• Mane Gómez (Importaciones &amp; Tráfico Aduanal Manzanillo TNT)</w:t>
               <w:br/>
               <w:t>• Andrea Ramírez (Atención al Cliente &amp; Operaciones Formatex)</w:t>
+              <w:br/>
+              <w:t>• Israel (Jefe de Almacén &amp; Logística Formatex)</w:t>
+              <w:br/>
+              <w:t>• Don Ricardo Pérez (Director General &amp; Propietario Formatex &amp; Telares)</w:t>
               <w:br/>
               <w:t>• Jonathan Palacios (Dirección Técnica &amp; Desarrollo WMS Movida TCI)</w:t>
               <w:br/>
@@ -333,7 +337,7 @@
           <w:rFonts w:ascii="Arial" w:hAnsi="Arial"/>
           <w:b/>
           <w:color w:val="1B365D"/>
-          <w:sz w:val="26"/>
+          <w:sz w:val="25"/>
         </w:rPr>
         <w:t>1. Propósito y Marco de Aceptación Vinculante</w:t>
       </w:r>
@@ -346,9 +350,9 @@
         <w:rPr>
           <w:rFonts w:ascii="Arial" w:hAnsi="Arial"/>
           <w:color w:val="334155"/>
-          <w:sz w:val="19"/>
+          <w:sz w:val="18"/>
         </w:rPr>
-        <w:t>El presente documento recopila y formaliza de manera transparente y exhaustiva todas las reglas de negocio, criterios de costeo, flujos de trabajo inter-empresa y políticas de control consensuados durante la entrevista operativa sostenida el 16 de octubre de 2026 entre el área de Compras e Importaciones de Telares y Tejidos / Formatex y el equipo de ingeniería de Movida TCI.</w:t>
+        <w:t>El presente documento formaliza de manera transparente y exhaustiva todas las reglas de negocio, criterios de costeo, flujos operativos, modelos de traspaso y políticas administrativas consensuados entre el área de Compras e Importaciones de Telares y Tejidos / Formatex y el equipo de ingeniería de Movida TCI, integrando la documentación oficial recibida de Elba Vázquez (pedimentos SAT, fórmulas de costeo landed, órdenes de compra a proveedores chinos y formatos de traspaso).</w:t>
       </w:r>
     </w:p>
     <w:p>
@@ -359,9 +363,9 @@
         <w:rPr>
           <w:rFonts w:ascii="Arial" w:hAnsi="Arial"/>
           <w:color w:val="334155"/>
-          <w:sz w:val="19"/>
+          <w:sz w:val="18"/>
         </w:rPr>
-        <w:t>Este documento actúa como anexo técnico vinculante. Su finalidad es respaldar por escrito el alcance, las fórmulas y los criterios de aceptación para que ambas organizaciones operen bajo un marco único y homologado, evitando ambigüedades operativas y garantizando que el WMS 360° digitalice con total fidelidad la cadena de compras internacionales.</w:t>
+        <w:t>Este anexo técnico constituye la base oficial vinculante para el subsistema de Compras e Importaciones del WMS 360°, garantizando una arquitectura robusta para la cadena de suministro internacional (China) y la logística de reposición entre las empresas hermanas.</w:t>
       </w:r>
     </w:p>
     <w:p>
@@ -374,9 +378,9 @@
           <w:rFonts w:ascii="Arial" w:hAnsi="Arial"/>
           <w:b/>
           <w:color w:val="1B365D"/>
-          <w:sz w:val="26"/>
+          <w:sz w:val="25"/>
         </w:rPr>
-        <w:t>2. Regla de Negocio 1: Arquitectura Inter-Compañía y Separación Operativa</w:t>
+        <w:t>2. Regla de Negocio 1: Arquitectura Inter-Compañía y 'Las Dos Camisas de Elba'</w:t>
       </w:r>
     </w:p>
     <w:p>
@@ -389,9 +393,9 @@
           <w:rFonts w:ascii="Arial" w:hAnsi="Arial"/>
           <w:b/>
           <w:color w:val="0284C7"/>
-          <w:sz w:val="22"/>
+          <w:sz w:val="21"/>
         </w:rPr>
-        <w:t>2.1. Funciones y Roles por Razón Social</w:t>
+        <w:t>2.1. Estructura del Grupo Textil y Razones Sociales</w:t>
       </w:r>
     </w:p>
     <w:p>
@@ -404,17 +408,17 @@
           <w:rFonts w:ascii="Arial" w:hAnsi="Arial"/>
           <w:b/>
           <w:color w:val="1B365D"/>
-          <w:sz w:val="19"/>
+          <w:sz w:val="18"/>
         </w:rPr>
-        <w:t xml:space="preserve">Telares y Tejidos (TNT): </w:t>
+        <w:t xml:space="preserve">Telares y Tejidos S.A. de C.V. (TNT / Rensselaer — Bodega Río Tototlán BOD-TNT): </w:t>
       </w:r>
       <w:r>
         <w:rPr>
           <w:rFonts w:ascii="Arial" w:hAnsi="Arial"/>
           <w:color w:val="334155"/>
-          <w:sz w:val="19"/>
+          <w:sz w:val="18"/>
         </w:rPr>
-        <w:t>Razón social compradora e importadora oficial. Adquiere telas a proveedores en el extranjero (China) y fabricantes nacionales. Contrata freight forwarders, fletes marítimos, seguros de transporte y liquidación de pedimentos aduanales en puerto (Manzanillo). Su bodega (Bodega Rensselaer) opera como almacén matriz de resguardo masivo de rollos.</w:t>
+        <w:t>Persona moral importadora oficial ante el SAT. Realiza las compras internacionales a molinos en China en USD, gestiona fletes marítimos a Manzanillo, seguros y liquidación de pedimentos aduanales. Su bodega opera como Hub Paletizado de Entrada con bultos y pallets cerrados. En Telares no existe mesa de corte ni servicio de retazos.</w:t>
       </w:r>
     </w:p>
     <w:p>
@@ -427,17 +431,17 @@
           <w:rFonts w:ascii="Arial" w:hAnsi="Arial"/>
           <w:b/>
           <w:color w:val="1B365D"/>
-          <w:sz w:val="19"/>
+          <w:sz w:val="18"/>
         </w:rPr>
-        <w:t xml:space="preserve">Forma Textil (Formatex): </w:t>
+        <w:t xml:space="preserve">Forma Textil S. de R.L. de C.V. (Formatex — Bodega Matriz Zapopan BOD-PRI): </w:t>
       </w:r>
       <w:r>
         <w:rPr>
           <w:rFonts w:ascii="Arial" w:hAnsi="Arial"/>
           <w:color w:val="334155"/>
-          <w:sz w:val="19"/>
+          <w:sz w:val="18"/>
         </w:rPr>
-        <w:t>Razón social comercializadora minorista/mayorista. Cuenta con espacio físico limitado en su bodega de distribución, imposibilitando recibir contenedores enteros de 700 a 900 rollos. Se abastece de Telares y Tejidos mediante traspasos continuos bajo demanda diaria.</w:t>
+        <w:t>Persona moral dedicada a la comercialización mayorista, canal ATC y proyectos corporativos. Al contar con espacio físico limitado en Zapopan (Río La Barca), no puede albergar contenedores completos (600 a 900 rollos), por lo que se resurte continuamente de Telares solicitando rollos completos de 50 metros bajo demanda.</w:t>
       </w:r>
     </w:p>
     <w:p>
@@ -450,52 +454,9 @@
           <w:rFonts w:ascii="Arial" w:hAnsi="Arial"/>
           <w:b/>
           <w:color w:val="0284C7"/>
-          <w:sz w:val="22"/>
+          <w:sz w:val="21"/>
         </w:rPr>
-        <w:t>2.2. Alcance en WMS 360° (Módulo Administrativo Integrado)</w:t>
-      </w:r>
-    </w:p>
-    <w:p>
-      <w:pPr>
-        <w:spacing w:before="0" w:after="80"/>
-      </w:pPr>
-      <w:r>
-        <w:rPr>
-          <w:rFonts w:ascii="Arial" w:hAnsi="Arial"/>
-          <w:color w:val="334155"/>
-          <w:sz w:val="19"/>
-        </w:rPr>
-        <w:t>El sistema WMS unificará la administración de compras e importaciones en una sola plataforma sin duplicar sistemas. Permitirá administrar proveedores internacionales, órdenes de compra en USD, tránsitos marítimos y costeo Landed en MXN de Telares y Tejidos, compartiendo nativamente los catálogos y la visibilidad de inventario hacia Formatex.</w:t>
-      </w:r>
-    </w:p>
-    <w:p>
-      <w:pPr>
-        <w:keepNext/>
-        <w:spacing w:before="280" w:after="80"/>
-      </w:pPr>
-      <w:r>
-        <w:rPr>
-          <w:rFonts w:ascii="Arial" w:hAnsi="Arial"/>
-          <w:b/>
-          <w:color w:val="1B365D"/>
-          <w:sz w:val="26"/>
-        </w:rPr>
-        <w:t>3. Regla de Negocio 2: Ciclo de Compras Internacionales a China y Frecuencia de Órdenes</w:t>
-      </w:r>
-    </w:p>
-    <w:p>
-      <w:pPr>
-        <w:keepNext/>
-        <w:spacing w:before="160" w:after="60"/>
-      </w:pPr>
-      <w:r>
-        <w:rPr>
-          <w:rFonts w:ascii="Arial" w:hAnsi="Arial"/>
-          <w:b/>
-          <w:color w:val="0284C7"/>
-          <w:sz w:val="22"/>
-        </w:rPr>
-        <w:t>3.1. Frecuencia y Detonación de Órdenes</w:t>
+        <w:t>2.2. El Rol Dual de Elba Vázquez (Las Dos Camisas)</w:t>
       </w:r>
     </w:p>
     <w:p>
@@ -508,17 +469,17 @@
           <w:rFonts w:ascii="Arial" w:hAnsi="Arial"/>
           <w:b/>
           <w:color w:val="1B365D"/>
-          <w:sz w:val="19"/>
+          <w:sz w:val="18"/>
         </w:rPr>
-        <w:t xml:space="preserve">Frecuencia Oficial: </w:t>
+        <w:t xml:space="preserve">Camisa Telares (Compras Internacionales China): </w:t>
       </w:r>
       <w:r>
         <w:rPr>
           <w:rFonts w:ascii="Arial" w:hAnsi="Arial"/>
           <w:color w:val="334155"/>
-          <w:sz w:val="19"/>
+          <w:sz w:val="18"/>
         </w:rPr>
-        <w:t>Se genera una (1) orden de compra semanal a fábricas en China.</w:t>
+        <w:t>Negocia con molinos chinos en USD, programa fechas de zarpe marítimo, supervisa la llegada de contenedores a Manzanillo con Mane Gómez y calcula el costeo Landed en moneda nacional al ingresar la mercancía a BOD-TNT.</w:t>
       </w:r>
     </w:p>
     <w:p>
@@ -531,506 +492,17 @@
           <w:rFonts w:ascii="Arial" w:hAnsi="Arial"/>
           <w:b/>
           <w:color w:val="1B365D"/>
-          <w:sz w:val="19"/>
+          <w:sz w:val="18"/>
         </w:rPr>
-        <w:t xml:space="preserve">Detonante Administrativo: </w:t>
+        <w:t xml:space="preserve">Camisa Formatex (Resurtido Local Inter-Compañía): </w:t>
       </w:r>
       <w:r>
         <w:rPr>
           <w:rFonts w:ascii="Arial" w:hAnsi="Arial"/>
           <w:color w:val="334155"/>
-          <w:sz w:val="19"/>
+          <w:sz w:val="18"/>
         </w:rPr>
-        <w:t>La orden semanal se emite a partir del análisis y directiva de resurtido enviada por Dirección General (Ricardo Zerpa / Dirección), determinando metrajes y telas a producir.</w:t>
-      </w:r>
-    </w:p>
-    <w:p>
-      <w:pPr>
-        <w:keepNext/>
-        <w:spacing w:before="160" w:after="60"/>
-      </w:pPr>
-      <w:r>
-        <w:rPr>
-          <w:rFonts w:ascii="Arial" w:hAnsi="Arial"/>
-          <w:b/>
-          <w:color w:val="0284C7"/>
-          <w:sz w:val="22"/>
-        </w:rPr>
-        <w:t>3.2. Ciclos de Fabricación y Tránsito</w:t>
-      </w:r>
-    </w:p>
-    <w:p>
-      <w:pPr>
-        <w:pStyle w:val="ListBullet"/>
-        <w:spacing w:before="20" w:after="40"/>
-      </w:pPr>
-      <w:r>
-        <w:rPr>
-          <w:rFonts w:ascii="Arial" w:hAnsi="Arial"/>
-          <w:b/>
-          <w:color w:val="1B365D"/>
-          <w:sz w:val="19"/>
-        </w:rPr>
-        <w:t xml:space="preserve">Tiempos de Fabricación: </w:t>
-      </w:r>
-      <w:r>
-        <w:rPr>
-          <w:rFonts w:ascii="Arial" w:hAnsi="Arial"/>
-          <w:color w:val="334155"/>
-          <w:sz w:val="19"/>
-        </w:rPr>
-        <w:t>La producción en plantas textiles de China requiere de 4 a 8 semanas según el proveedor y tipo de tela.</w:t>
-      </w:r>
-    </w:p>
-    <w:p>
-      <w:pPr>
-        <w:pStyle w:val="ListBullet"/>
-        <w:spacing w:before="20" w:after="40"/>
-      </w:pPr>
-      <w:r>
-        <w:rPr>
-          <w:rFonts w:ascii="Arial" w:hAnsi="Arial"/>
-          <w:b/>
-          <w:color w:val="1B365D"/>
-          <w:sz w:val="19"/>
-        </w:rPr>
-        <w:t xml:space="preserve">Logística Marítima: </w:t>
-      </w:r>
-      <w:r>
-        <w:rPr>
-          <w:rFonts w:ascii="Arial" w:hAnsi="Arial"/>
-          <w:color w:val="334155"/>
-          <w:sz w:val="19"/>
-        </w:rPr>
-        <w:t>Se coordina la recolección con el forwarder hacia buque carguero con destino típico al Puerto de Manzanillo, Colima.</w:t>
-      </w:r>
-    </w:p>
-    <w:p>
-      <w:pPr>
-        <w:pStyle w:val="ListBullet"/>
-        <w:spacing w:before="20" w:after="40"/>
-      </w:pPr>
-      <w:r>
-        <w:rPr>
-          <w:rFonts w:ascii="Arial" w:hAnsi="Arial"/>
-          <w:b/>
-          <w:color w:val="1B365D"/>
-          <w:sz w:val="19"/>
-        </w:rPr>
-        <w:t xml:space="preserve">Capacidad de Embarque: </w:t>
-      </w:r>
-      <w:r>
-        <w:rPr>
-          <w:rFonts w:ascii="Arial" w:hAnsi="Arial"/>
-          <w:color w:val="334155"/>
-          <w:sz w:val="19"/>
-        </w:rPr>
-        <w:t>Cada contenedor marítimo alberga típicamente entre 600, 700 y hasta 900 rollos de tela.</w:t>
-      </w:r>
-    </w:p>
-    <w:p>
-      <w:pPr>
-        <w:keepNext/>
-        <w:spacing w:before="160" w:after="60"/>
-      </w:pPr>
-      <w:r>
-        <w:rPr>
-          <w:rFonts w:ascii="Arial" w:hAnsi="Arial"/>
-          <w:b/>
-          <w:color w:val="0284C7"/>
-          <w:sz w:val="22"/>
-        </w:rPr>
-        <w:t>3.3. Ciclo de Vida de la Orden de Compra Internacional</w:t>
-      </w:r>
-    </w:p>
-    <w:p>
-      <w:pPr>
-        <w:spacing w:before="0" w:after="80"/>
-      </w:pPr>
-      <w:r>
-        <w:rPr>
-          <w:rFonts w:ascii="Arial" w:hAnsi="Arial"/>
-          <w:color w:val="334155"/>
-          <w:sz w:val="19"/>
-        </w:rPr>
-        <w:t>El WMS reemplaza las hojas de cálculo manuales con un flujo de estados estandarizado:</w:t>
-      </w:r>
-    </w:p>
-    <w:p>
-      <w:pPr>
-        <w:pStyle w:val="ListBullet"/>
-        <w:spacing w:before="20" w:after="40"/>
-      </w:pPr>
-      <w:r>
-        <w:rPr>
-          <w:rFonts w:ascii="Arial" w:hAnsi="Arial"/>
-          <w:b/>
-          <w:color w:val="1B365D"/>
-          <w:sz w:val="19"/>
-        </w:rPr>
-        <w:t xml:space="preserve">1. BORRADOR: </w:t>
-      </w:r>
-      <w:r>
-        <w:rPr>
-          <w:rFonts w:ascii="Arial" w:hAnsi="Arial"/>
-          <w:color w:val="334155"/>
-          <w:sz w:val="19"/>
-        </w:rPr>
-        <w:t>Orden en confección basada en la directiva de resurtido.</w:t>
-      </w:r>
-    </w:p>
-    <w:p>
-      <w:pPr>
-        <w:pStyle w:val="ListBullet"/>
-        <w:spacing w:before="20" w:after="40"/>
-      </w:pPr>
-      <w:r>
-        <w:rPr>
-          <w:rFonts w:ascii="Arial" w:hAnsi="Arial"/>
-          <w:b/>
-          <w:color w:val="1B365D"/>
-          <w:sz w:val="19"/>
-        </w:rPr>
-        <w:t xml:space="preserve">2. EMITIDA_PROVEEDOR: </w:t>
-      </w:r>
-      <w:r>
-        <w:rPr>
-          <w:rFonts w:ascii="Arial" w:hAnsi="Arial"/>
-          <w:color w:val="334155"/>
-          <w:sz w:val="19"/>
-        </w:rPr>
-        <w:t>Transmitida formalmente a la fábrica en China con costos pactados en USD.</w:t>
-      </w:r>
-    </w:p>
-    <w:p>
-      <w:pPr>
-        <w:pStyle w:val="ListBullet"/>
-        <w:spacing w:before="20" w:after="40"/>
-      </w:pPr>
-      <w:r>
-        <w:rPr>
-          <w:rFonts w:ascii="Arial" w:hAnsi="Arial"/>
-          <w:b/>
-          <w:color w:val="1B365D"/>
-          <w:sz w:val="19"/>
-        </w:rPr>
-        <w:t xml:space="preserve">3. EN_PRODUCCION: </w:t>
-      </w:r>
-      <w:r>
-        <w:rPr>
-          <w:rFonts w:ascii="Arial" w:hAnsi="Arial"/>
-          <w:color w:val="334155"/>
-          <w:sz w:val="19"/>
-        </w:rPr>
-        <w:t>En hilado, teñido y acabado en planta textil (4 a 8 semanas).</w:t>
-      </w:r>
-    </w:p>
-    <w:p>
-      <w:pPr>
-        <w:pStyle w:val="ListBullet"/>
-        <w:spacing w:before="20" w:after="40"/>
-      </w:pPr>
-      <w:r>
-        <w:rPr>
-          <w:rFonts w:ascii="Arial" w:hAnsi="Arial"/>
-          <w:b/>
-          <w:color w:val="1B365D"/>
-          <w:sz w:val="19"/>
-        </w:rPr>
-        <w:t xml:space="preserve">4. ZARPADO_EN_TRANSITO: </w:t>
-      </w:r>
-      <w:r>
-        <w:rPr>
-          <w:rFonts w:ascii="Arial" w:hAnsi="Arial"/>
-          <w:color w:val="334155"/>
-          <w:sz w:val="19"/>
-        </w:rPr>
-        <w:t>A bordo de buque marítimo, con número oficial de contenedor y fecha estimada de arribo (ETA).</w:t>
-      </w:r>
-    </w:p>
-    <w:p>
-      <w:pPr>
-        <w:pStyle w:val="ListBullet"/>
-        <w:spacing w:before="20" w:after="40"/>
-      </w:pPr>
-      <w:r>
-        <w:rPr>
-          <w:rFonts w:ascii="Arial" w:hAnsi="Arial"/>
-          <w:b/>
-          <w:color w:val="1B365D"/>
-          <w:sz w:val="19"/>
-        </w:rPr>
-        <w:t xml:space="preserve">5. EN_PUERTO_ADUANA: </w:t>
-      </w:r>
-      <w:r>
-        <w:rPr>
-          <w:rFonts w:ascii="Arial" w:hAnsi="Arial"/>
-          <w:color w:val="334155"/>
-          <w:sz w:val="19"/>
-        </w:rPr>
-        <w:t>En puerto mexicano para maniobras, revisión previa y desaduanamiento fiscal.</w:t>
-      </w:r>
-    </w:p>
-    <w:p>
-      <w:pPr>
-        <w:pStyle w:val="ListBullet"/>
-        <w:spacing w:before="20" w:after="40"/>
-      </w:pPr>
-      <w:r>
-        <w:rPr>
-          <w:rFonts w:ascii="Arial" w:hAnsi="Arial"/>
-          <w:b/>
-          <w:color w:val="1B365D"/>
-          <w:sz w:val="19"/>
-        </w:rPr>
-        <w:t xml:space="preserve">6. RECEPCION_BODEGA_TNT: </w:t>
-      </w:r>
-      <w:r>
-        <w:rPr>
-          <w:rFonts w:ascii="Arial" w:hAnsi="Arial"/>
-          <w:color w:val="334155"/>
-          <w:sz w:val="19"/>
-        </w:rPr>
-        <w:t>Descargado en Bodega Rensselaer para costeo definitivo e ingreso al stock.</w:t>
-      </w:r>
-    </w:p>
-    <w:p>
-      <w:pPr>
-        <w:keepNext/>
-        <w:spacing w:before="280" w:after="80"/>
-      </w:pPr>
-      <w:r>
-        <w:rPr>
-          <w:rFonts w:ascii="Arial" w:hAnsi="Arial"/>
-          <w:b/>
-          <w:color w:val="1B365D"/>
-          <w:sz w:val="26"/>
-        </w:rPr>
-        <w:t>4. Regla de Negocio 3: Homologación del Catálogo (Nombre Chino vs. Nombre Comercial)</w:t>
-      </w:r>
-    </w:p>
-    <w:p>
-      <w:pPr>
-        <w:keepNext/>
-        <w:spacing w:before="160" w:after="60"/>
-      </w:pPr>
-      <w:r>
-        <w:rPr>
-          <w:rFonts w:ascii="Arial" w:hAnsi="Arial"/>
-          <w:b/>
-          <w:color w:val="0284C7"/>
-          <w:sz w:val="22"/>
-        </w:rPr>
-        <w:t>4.1. Diagnóstico del Proceso Actual</w:t>
-      </w:r>
-    </w:p>
-    <w:p>
-      <w:pPr>
-        <w:spacing w:before="0" w:after="80"/>
-      </w:pPr>
-      <w:r>
-        <w:rPr>
-          <w:rFonts w:ascii="Arial" w:hAnsi="Arial"/>
-          <w:color w:val="334155"/>
-          <w:sz w:val="19"/>
-        </w:rPr>
-        <w:t>Los proveedores en China identifican los productos con códigos y denominaciones técnicas de fábrica (ej. XY-9082 Polyester Twill). En México, Formatex comercializa la tela bajo un Nombre Comercial oficial (ej. Lino Provenza Crudo). Actualmente este cruce se efectúa de memoria o en archivos de Excel dispersos.</w:t>
-      </w:r>
-    </w:p>
-    <w:p>
-      <w:pPr>
-        <w:keepNext/>
-        <w:spacing w:before="160" w:after="60"/>
-      </w:pPr>
-      <w:r>
-        <w:rPr>
-          <w:rFonts w:ascii="Arial" w:hAnsi="Arial"/>
-          <w:b/>
-          <w:color w:val="0284C7"/>
-          <w:sz w:val="22"/>
-        </w:rPr>
-        <w:t>4.2. Ficha Técnica Unificada del Producto (Sku)</w:t>
-      </w:r>
-    </w:p>
-    <w:p>
-      <w:pPr>
-        <w:spacing w:before="0" w:after="80"/>
-      </w:pPr>
-      <w:r>
-        <w:rPr>
-          <w:rFonts w:ascii="Arial" w:hAnsi="Arial"/>
-          <w:color w:val="334155"/>
-          <w:sz w:val="19"/>
-        </w:rPr>
-        <w:t>En el catálogo del WMS, cada SKU textil integrará de forma obligatoria los atributos de equivalencia:</w:t>
-      </w:r>
-    </w:p>
-    <w:p>
-      <w:pPr>
-        <w:pStyle w:val="ListBullet"/>
-        <w:spacing w:before="20" w:after="40"/>
-      </w:pPr>
-      <w:r>
-        <w:rPr>
-          <w:rFonts w:ascii="Arial" w:hAnsi="Arial"/>
-          <w:b/>
-          <w:color w:val="1B365D"/>
-          <w:sz w:val="19"/>
-        </w:rPr>
-        <w:t xml:space="preserve">codigoChina / nombreChino: </w:t>
-      </w:r>
-      <w:r>
-        <w:rPr>
-          <w:rFonts w:ascii="Arial" w:hAnsi="Arial"/>
-          <w:color w:val="334155"/>
-          <w:sz w:val="19"/>
-        </w:rPr>
-        <w:t>Código y descripción técnica original del fabricante en China.</w:t>
-      </w:r>
-    </w:p>
-    <w:p>
-      <w:pPr>
-        <w:pStyle w:val="ListBullet"/>
-        <w:spacing w:before="20" w:after="40"/>
-      </w:pPr>
-      <w:r>
-        <w:rPr>
-          <w:rFonts w:ascii="Arial" w:hAnsi="Arial"/>
-          <w:b/>
-          <w:color w:val="1B365D"/>
-          <w:sz w:val="19"/>
-        </w:rPr>
-        <w:t xml:space="preserve">nombreComercial: </w:t>
-      </w:r>
-      <w:r>
-        <w:rPr>
-          <w:rFonts w:ascii="Arial" w:hAnsi="Arial"/>
-          <w:color w:val="334155"/>
-          <w:sz w:val="19"/>
-        </w:rPr>
-        <w:t>Nombre comercial y comercializable en México para cotización y facturación.</w:t>
-      </w:r>
-    </w:p>
-    <w:p>
-      <w:pPr>
-        <w:pStyle w:val="ListBullet"/>
-        <w:spacing w:before="20" w:after="40"/>
-      </w:pPr>
-      <w:r>
-        <w:rPr>
-          <w:rFonts w:ascii="Arial" w:hAnsi="Arial"/>
-          <w:b/>
-          <w:color w:val="1B365D"/>
-          <w:sz w:val="19"/>
-        </w:rPr>
-        <w:t xml:space="preserve">Especificaciones Técnicas: </w:t>
-      </w:r>
-      <w:r>
-        <w:rPr>
-          <w:rFonts w:ascii="Arial" w:hAnsi="Arial"/>
-          <w:color w:val="334155"/>
-          <w:sz w:val="19"/>
-        </w:rPr>
-        <w:t>Composición textil, ancho útil en metros, gramaje (g/m²) y proveedor de origen.</w:t>
-      </w:r>
-    </w:p>
-    <w:p>
-      <w:pPr>
-        <w:pStyle w:val="ListBullet"/>
-        <w:spacing w:before="20" w:after="40"/>
-      </w:pPr>
-      <w:r>
-        <w:rPr>
-          <w:rFonts w:ascii="Arial" w:hAnsi="Arial"/>
-          <w:b/>
-          <w:color w:val="1B365D"/>
-          <w:sz w:val="19"/>
-        </w:rPr>
-        <w:t xml:space="preserve">Catálogo Compartido: </w:t>
-      </w:r>
-      <w:r>
-        <w:rPr>
-          <w:rFonts w:ascii="Arial" w:hAnsi="Arial"/>
-          <w:color w:val="334155"/>
-          <w:sz w:val="19"/>
-        </w:rPr>
-        <w:t>El catálogo es único e idéntico para Telares y Formatex. Lo único que difiere son las existencias por almacén y los costos inter-empresa.</w:t>
-      </w:r>
-    </w:p>
-    <w:p>
-      <w:pPr>
-        <w:keepNext/>
-        <w:spacing w:before="280" w:after="80"/>
-      </w:pPr>
-      <w:r>
-        <w:rPr>
-          <w:rFonts w:ascii="Arial" w:hAnsi="Arial"/>
-          <w:b/>
-          <w:color w:val="1B365D"/>
-          <w:sz w:val="26"/>
-        </w:rPr>
-        <w:t>5. Regla de Negocio 4: Doble Costeo, Divisas y Trazabilidad Histórica por Pedimento</w:t>
-      </w:r>
-    </w:p>
-    <w:p>
-      <w:pPr>
-        <w:keepNext/>
-        <w:spacing w:before="160" w:after="60"/>
-      </w:pPr>
-      <w:r>
-        <w:rPr>
-          <w:rFonts w:ascii="Arial" w:hAnsi="Arial"/>
-          <w:b/>
-          <w:color w:val="0284C7"/>
-          <w:sz w:val="22"/>
-        </w:rPr>
-        <w:t>5.1. Doble Dimensión de Costo Obligatoria</w:t>
-      </w:r>
-    </w:p>
-    <w:p>
-      <w:pPr>
-        <w:pStyle w:val="ListBullet"/>
-        <w:spacing w:before="20" w:after="40"/>
-      </w:pPr>
-      <w:r>
-        <w:rPr>
-          <w:rFonts w:ascii="Arial" w:hAnsi="Arial"/>
-          <w:b/>
-          <w:color w:val="1B365D"/>
-          <w:sz w:val="19"/>
-        </w:rPr>
-        <w:t xml:space="preserve">Costo en Origen (costoOrigenUSD): </w:t>
-      </w:r>
-      <w:r>
-        <w:rPr>
-          <w:rFonts w:ascii="Arial" w:hAnsi="Arial"/>
-          <w:color w:val="334155"/>
-          <w:sz w:val="19"/>
-        </w:rPr>
-        <w:t>Precio unitario pactado con el proveedor en Dólares Americanos ($/m USD).</w:t>
-      </w:r>
-    </w:p>
-    <w:p>
-      <w:pPr>
-        <w:pStyle w:val="ListBullet"/>
-        <w:spacing w:before="20" w:after="40"/>
-      </w:pPr>
-      <w:r>
-        <w:rPr>
-          <w:rFonts w:ascii="Arial" w:hAnsi="Arial"/>
-          <w:b/>
-          <w:color w:val="1B365D"/>
-          <w:sz w:val="19"/>
-        </w:rPr>
-        <w:t xml:space="preserve">Costo Puesto en México (costoPuestoMexicoMXN / Landed Cost): </w:t>
-      </w:r>
-      <w:r>
-        <w:rPr>
-          <w:rFonts w:ascii="Arial" w:hAnsi="Arial"/>
-          <w:color w:val="334155"/>
-          <w:sz w:val="19"/>
-        </w:rPr>
-        <w:t>Costo final en Pesos Mexicanos ($/m MXN) integrando flete marítimo, seguro internacional, maniobras portuarias, almacenajes e impuestos aduanales (aranceles/DTA).</w:t>
+        <w:t>Analiza los faltantes de inventario en Zapopan junto con Israel (Jefe de Almacén) y emite requisiciones de traspaso a Telares para que la camioneta propia de Formatex recoja los rollos en Tototlán.</w:t>
       </w:r>
     </w:p>
     <w:tbl>
@@ -1072,7 +544,7 @@
                 <w:color w:val="0E7490"/>
                 <w:sz w:val="20"/>
               </w:rPr>
-              <w:t>📌 REGLA CRÍTICA: ANCLAJE HISTÓRICO AL TIPO DE CAMBIO DEL PEDIMENTO</w:t>
+              <w:t>📌 Decisión de Diseño en WMS 360+</w:t>
               <w:br/>
             </w:r>
             <w:r>
@@ -1081,7 +553,7 @@
                 <w:color w:val="334155"/>
                 <w:sz w:val="19"/>
               </w:rPr>
-              <w:t>Queda estrictamente prohibido recalcular costos históricos de compras anteriores utilizando el tipo de cambio del día de la consulta o tasas flotantes del DOF actual. Todo costeo en moneda nacional queda anclado de forma inmutable al Tipo de Cambio Oficial del Pedimento Aduanal liquidado en la fecha de despacho ante el SAT. El WMS registrará obligatoriamente: Folio oficial de Pedimento (15 dígitos), Fecha de Pago del Pedimento, Tipo de Cambio del Pedimento, Aduana de Despacho y Agente Aduanal.</w:t>
+              <w:t>El módulo de Compras (/compras) cuenta con un selector corporativo dual: Modo Telares (Compras China en USD, Contenedores FCL y Pedimentos) y Modo Formatex (Requisiciones de rollos enteros hacia Tototlán con generación de vales de camioneta).</w:t>
             </w:r>
           </w:p>
         </w:tc>
@@ -1102,24 +574,9 @@
           <w:rFonts w:ascii="Arial" w:hAnsi="Arial"/>
           <w:b/>
           <w:color w:val="1B365D"/>
-          <w:sz w:val="26"/>
+          <w:sz w:val="25"/>
         </w:rPr>
-        <w:t>6. Regla de Negocio 5: Reposición Inter-Bodegas (Telares y Tejidos → Formatex)</w:t>
-      </w:r>
-    </w:p>
-    <w:p>
-      <w:pPr>
-        <w:keepNext/>
-        <w:spacing w:before="160" w:after="60"/>
-      </w:pPr>
-      <w:r>
-        <w:rPr>
-          <w:rFonts w:ascii="Arial" w:hAnsi="Arial"/>
-          <w:b/>
-          <w:color w:val="0284C7"/>
-          <w:sz w:val="22"/>
-        </w:rPr>
-        <w:t>6.1. Frecuencia y Modalidades de Pedido</w:t>
+        <w:t>3. Regla de Negocio 2: Ciclo de Compras Internacionales a China y Frecuencia de Órdenes</w:t>
       </w:r>
     </w:p>
     <w:p>
@@ -1132,17 +589,17 @@
           <w:rFonts w:ascii="Arial" w:hAnsi="Arial"/>
           <w:b/>
           <w:color w:val="1B365D"/>
-          <w:sz w:val="19"/>
+          <w:sz w:val="18"/>
         </w:rPr>
-        <w:t xml:space="preserve">Frecuencia Regular: </w:t>
+        <w:t xml:space="preserve">Frecuencia de Órdenes: </w:t>
       </w:r>
       <w:r>
         <w:rPr>
           <w:rFonts w:ascii="Arial" w:hAnsi="Arial"/>
           <w:color w:val="334155"/>
-          <w:sz w:val="19"/>
+          <w:sz w:val="18"/>
         </w:rPr>
-        <w:t>Se efectúan de cinco (5) a seis (6) pedidos semanales de Formatex hacia Telares.</w:t>
+        <w:t>Se genera una (1) orden de compra semanal a China a partir de la directiva y corrida semanal de resurtido de Dirección General (Don Ricardo Pérez).</w:t>
       </w:r>
     </w:p>
     <w:p>
@@ -1155,17 +612,17 @@
           <w:rFonts w:ascii="Arial" w:hAnsi="Arial"/>
           <w:b/>
           <w:color w:val="1B365D"/>
-          <w:sz w:val="19"/>
+          <w:sz w:val="18"/>
         </w:rPr>
-        <w:t xml:space="preserve">Consolidado Matutino Diario: </w:t>
+        <w:t xml:space="preserve">Tiempos de Fabricación y Tránsito: </w:t>
       </w:r>
       <w:r>
         <w:rPr>
           <w:rFonts w:ascii="Arial" w:hAnsi="Arial"/>
           <w:color w:val="334155"/>
-          <w:sz w:val="19"/>
+          <w:sz w:val="18"/>
         </w:rPr>
-        <w:t>Al inicio de cada jornada se genera una orden concentrada que agrupa los rollos requeridos por los clientes cuyas compras se formalizaron el día anterior. La transferencia física se realiza y recibe el mismo día.</w:t>
+        <w:t>La producción en las fábricas de China oscila entre 4, 6 y 8 semanas según el tipo de tejido. Los buques navegan hacia el Puerto de Manzanillo, Colima (Aduana 160).</w:t>
       </w:r>
     </w:p>
     <w:p>
@@ -1178,45 +635,40 @@
           <w:rFonts w:ascii="Arial" w:hAnsi="Arial"/>
           <w:b/>
           <w:color w:val="1B365D"/>
-          <w:sz w:val="19"/>
+          <w:sz w:val="18"/>
         </w:rPr>
-        <w:t xml:space="preserve">Traspasos Exprés Vespertinos: </w:t>
+        <w:t xml:space="preserve">Capacidad de Embarque: </w:t>
       </w:r>
       <w:r>
         <w:rPr>
           <w:rFonts w:ascii="Arial" w:hAnsi="Arial"/>
           <w:color w:val="334155"/>
-          <w:sz w:val="19"/>
+          <w:sz w:val="18"/>
         </w:rPr>
-        <w:t>Para pedidos críticos de la tarde, el sistema admite tramitar órdenes urgentes de reposición desde un (1) rollo individual.</w:t>
+        <w:t>Cada contenedor marítimo alberga típicamente entre 600, 700 y hasta 900 rollos de tela (aprox. 30,000 a 50,000 metros lineales).</w:t>
       </w:r>
     </w:p>
     <w:p>
       <w:pPr>
-        <w:keepNext/>
-        <w:spacing w:before="160" w:after="60"/>
+        <w:pStyle w:val="ListBullet"/>
+        <w:spacing w:before="20" w:after="40"/>
       </w:pPr>
       <w:r>
         <w:rPr>
           <w:rFonts w:ascii="Arial" w:hAnsi="Arial"/>
           <w:b/>
-          <w:color w:val="0284C7"/>
-          <w:sz w:val="22"/>
+          <w:color w:val="1B365D"/>
+          <w:sz w:val="18"/>
         </w:rPr>
-        <w:t>6.2. Coordinación Operativa de Almacén</w:t>
+        <w:t xml:space="preserve">Ciclo de Estados en WMS: </w:t>
       </w:r>
-    </w:p>
-    <w:p>
-      <w:pPr>
-        <w:spacing w:before="0" w:after="80"/>
-      </w:pPr>
       <w:r>
         <w:rPr>
           <w:rFonts w:ascii="Arial" w:hAnsi="Arial"/>
           <w:color w:val="334155"/>
-          <w:sz w:val="19"/>
+          <w:sz w:val="18"/>
         </w:rPr>
-        <w:t>La coordinación física de carga, traslado y descarga entre Bodega Rensselaer y Formatex es gestionada operativamente por Israel (Almacén). El WMS registrará el pase de salida de Telares y la recepción en Formatex para conciliación inmediata de stock.</w:t>
+        <w:t>BORRADOR ➔ CONFIRMADA ➔ ENVIADA_PROVEEDOR ➔ EN_TRANSITO (con contenedor y ETA) ➔ EN_RECEPCION (en Bodega Tototlán) ➔ COMPLETADA.</w:t>
       </w:r>
     </w:p>
     <w:p>
@@ -1229,24 +681,9 @@
           <w:rFonts w:ascii="Arial" w:hAnsi="Arial"/>
           <w:b/>
           <w:color w:val="1B365D"/>
-          <w:sz w:val="26"/>
+          <w:sz w:val="25"/>
         </w:rPr>
-        <w:t>7. Regla de Negocio 6: Facturación Inter-Compañía y Regla de Protección de Margen</w:t>
-      </w:r>
-    </w:p>
-    <w:p>
-      <w:pPr>
-        <w:keepNext/>
-        <w:spacing w:before="160" w:after="60"/>
-      </w:pPr>
-      <w:r>
-        <w:rPr>
-          <w:rFonts w:ascii="Arial" w:hAnsi="Arial"/>
-          <w:b/>
-          <w:color w:val="0284C7"/>
-          <w:sz w:val="22"/>
-        </w:rPr>
-        <w:t>7.1. Margen Inter-Empresa (Telares a Formatex)</w:t>
+        <w:t>4. Regla de Negocio 3: Homologación del Catálogo (Nombre Chino vs. Nombre Comercial)</w:t>
       </w:r>
     </w:p>
     <w:p>
@@ -1257,9 +694,83 @@
         <w:rPr>
           <w:rFonts w:ascii="Arial" w:hAnsi="Arial"/>
           <w:color w:val="334155"/>
-          <w:sz w:val="19"/>
+          <w:sz w:val="18"/>
         </w:rPr>
-        <w:t>Telares y Tejidos factura la mercancía transferida a Formatex sumando un margen pactado de entre el 7% y el 12% sobre el costo de importación puesto en México.</w:t>
+        <w:t>En China las fábricas identifican cada tejido con códigos técnicos (ej. XY-9082 Poly Twill), mientras que en México se comercializa bajo un Nombre Comercial en español (ej. Lino Provenza Crudo).</w:t>
+      </w:r>
+    </w:p>
+    <w:p>
+      <w:pPr>
+        <w:pStyle w:val="ListBullet"/>
+        <w:spacing w:before="20" w:after="40"/>
+      </w:pPr>
+      <w:r>
+        <w:rPr>
+          <w:rFonts w:ascii="Arial" w:hAnsi="Arial"/>
+          <w:b/>
+          <w:color w:val="1B365D"/>
+          <w:sz w:val="18"/>
+        </w:rPr>
+        <w:t xml:space="preserve">Catálogo Maestro Unificado (SkuMaster): </w:t>
+      </w:r>
+      <w:r>
+        <w:rPr>
+          <w:rFonts w:ascii="Arial" w:hAnsi="Arial"/>
+          <w:color w:val="334155"/>
+          <w:sz w:val="18"/>
+        </w:rPr>
+        <w:t>Cada SKU integra de forma nativa: código comercial interno, nombre comercial, color, composición, ancho útil, peso/gramaje y proveedor fabricante de origen.</w:t>
+      </w:r>
+    </w:p>
+    <w:p>
+      <w:pPr>
+        <w:pStyle w:val="ListBullet"/>
+        <w:spacing w:before="20" w:after="40"/>
+      </w:pPr>
+      <w:r>
+        <w:rPr>
+          <w:rFonts w:ascii="Arial" w:hAnsi="Arial"/>
+          <w:b/>
+          <w:color w:val="1B365D"/>
+          <w:sz w:val="18"/>
+        </w:rPr>
+        <w:t xml:space="preserve">Catálogo Compartido: </w:t>
+      </w:r>
+      <w:r>
+        <w:rPr>
+          <w:rFonts w:ascii="Arial" w:hAnsi="Arial"/>
+          <w:color w:val="334155"/>
+          <w:sz w:val="18"/>
+        </w:rPr>
+        <w:t>El catálogo de telas es único e idéntico para Telares y Formatex. No cambian nombres ni especificaciones técnicas; únicamente varían las existencias por bodega física y las cuentas contables de costeo.</w:t>
+      </w:r>
+    </w:p>
+    <w:p>
+      <w:pPr>
+        <w:keepNext/>
+        <w:spacing w:before="280" w:after="80"/>
+      </w:pPr>
+      <w:r>
+        <w:rPr>
+          <w:rFonts w:ascii="Arial" w:hAnsi="Arial"/>
+          <w:b/>
+          <w:color w:val="1B365D"/>
+          <w:sz w:val="25"/>
+        </w:rPr>
+        <w:t>5. Regla de Negocio 4: Doble Costeo, Divisas y Fórmula Oficial Landed de Elba</w:t>
+      </w:r>
+    </w:p>
+    <w:p>
+      <w:pPr>
+        <w:spacing w:before="0" w:after="80"/>
+      </w:pPr>
+      <w:r>
+        <w:rPr>
+          <w:rFonts w:ascii="Arial" w:hAnsi="Arial"/>
+          <w:color w:val="334155"/>
+          <w:sz w:val="18"/>
+        </w:rPr>
+        <w:t>Cada producto y embarque registra dos dimensiones de costo: Costo en Origen (USD/m) y Costo Puesto en México (Landed Cost MXN/m).</w:t>
       </w:r>
     </w:p>
     <w:tbl>
@@ -1276,7 +787,7 @@
         <w:tc>
           <w:tcPr>
             <w:tcW w:type="dxa" w:w="9360"/>
-            <w:shd w:fill="FFFBEB"/>
+            <w:shd w:fill="F0F9FF"/>
             <w:tcMar>
               <w:top w:w="140" w:type="dxa"/>
               <w:bottom w:w="140" w:type="dxa"/>
@@ -1284,7 +795,7 @@
               <w:right w:w="180" w:type="dxa"/>
             </w:tcMar>
             <w:tcBorders>
-              <w:left w:val="single" w:sz="24" w:space="0" w:color="D97706"/>
+              <w:left w:val="single" w:sz="24" w:space="0" w:color="0284C7"/>
               <w:top w:val="none"/>
               <w:right w:val="none"/>
               <w:bottom w:val="none"/>
@@ -1301,7 +812,7 @@
                 <w:color w:val="0E7490"/>
                 <w:sz w:val="20"/>
               </w:rPr>
-              <w:t>📌 REGLA DE PROTECCIÓN DE UTILIDAD: COSTO DEL ÚLTIMO EMBARQUE MÁS ALTO</w:t>
+              <w:t>📌 Fórmula Oficial de Costeo Landed (Elba Vázquez - CALCULO DE COSTOS.xlsx)</w:t>
               <w:br/>
             </w:r>
             <w:r>
@@ -1310,7 +821,14 @@
                 <w:color w:val="334155"/>
                 <w:sz w:val="19"/>
               </w:rPr>
-              <w:t>Cuando en las bodegas de Telares coexistan rollos de una misma tela ingresados en diferentes embarques o fechas con costos dispares de flete o divisas, el sistema tomará como base de facturación el costo del último embarque más alto recibido. Esta regla blinda a la empresa contra mermas en el margen ante encarecimientos logísticos sobrevenidos. El WMS emitirá un reporte preliminar de utilidad previo al timbrado fiscal del CFDI inter-empresa.</w:t>
+              <w:t>Costo Mercancía MXN = Precio FOB USD × TC Oficial Pedimento SAT</w:t>
+              <w:br/>
+              <w:t>Factor Gastos Incrementables = 1 + (Gastos Incrementables % / 100)  [aprox. 23.00%]</w:t>
+              <w:br/>
+              <w:t>Costo Landed Unitario = (Costo Mercancía MXN × Factor Incrementables) + (Flete Marítimo y Seguro Proporcional / Metros Contenedor)</w:t>
+              <w:br/>
+              <w:br/>
+              <w:t>Los incrementables consolidan: Arancel IGI, DTA, prevalidación SAT, flete marítimo, maniobras Manzanillo y honorarios de agencia aduanal.</w:t>
             </w:r>
           </w:p>
         </w:tc>
@@ -1323,6 +841,29 @@
     </w:p>
     <w:p>
       <w:pPr>
+        <w:pStyle w:val="ListBullet"/>
+        <w:spacing w:before="20" w:after="40"/>
+      </w:pPr>
+      <w:r>
+        <w:rPr>
+          <w:rFonts w:ascii="Arial" w:hAnsi="Arial"/>
+          <w:b/>
+          <w:color w:val="1B365D"/>
+          <w:sz w:val="18"/>
+        </w:rPr>
+        <w:t xml:space="preserve">Regla Crítica del Tipo de Cambio Histórico: </w:t>
+      </w:r>
+      <w:r>
+        <w:rPr>
+          <w:rFonts w:ascii="Arial" w:hAnsi="Arial"/>
+          <w:color w:val="334155"/>
+          <w:sz w:val="18"/>
+        </w:rPr>
+        <w:t>Queda estrictamente prohibido recalcular costos históricos con tasas flotantes actuales. El costo en pesos queda respaldado permanentemente por el Tipo de Cambio Oficial del Pedimento en la fecha de liquidación bancaria ante el SAT (ej. $18.3688 según PEDIMENTO.pdf).</w:t>
+      </w:r>
+    </w:p>
+    <w:p>
+      <w:pPr>
         <w:keepNext/>
         <w:spacing w:before="280" w:after="80"/>
       </w:pPr>
@@ -1331,37 +872,9 @@
           <w:rFonts w:ascii="Arial" w:hAnsi="Arial"/>
           <w:b/>
           <w:color w:val="1B365D"/>
-          <w:sz w:val="26"/>
+          <w:sz w:val="25"/>
         </w:rPr>
-        <w:t>8. Regla de Negocio 7: Integración con Atención al Cliente (ATC) y Disponibilidad Neta</w:t>
-      </w:r>
-    </w:p>
-    <w:p>
-      <w:pPr>
-        <w:keepNext/>
-        <w:spacing w:before="160" w:after="60"/>
-      </w:pPr>
-      <w:r>
-        <w:rPr>
-          <w:rFonts w:ascii="Arial" w:hAnsi="Arial"/>
-          <w:b/>
-          <w:color w:val="0284C7"/>
-          <w:sz w:val="22"/>
-        </w:rPr>
-        <w:t>8.1. Desglose Transparente de Disponibilidad</w:t>
-      </w:r>
-    </w:p>
-    <w:p>
-      <w:pPr>
-        <w:spacing w:before="0" w:after="80"/>
-      </w:pPr>
-      <w:r>
-        <w:rPr>
-          <w:rFonts w:ascii="Arial" w:hAnsi="Arial"/>
-          <w:color w:val="334155"/>
-          <w:sz w:val="19"/>
-        </w:rPr>
-        <w:t>Las asesoras de ATC visualizarán en sus consultas tres niveles de disponibilidad:</w:t>
+        <w:t>6. Regla de Negocio 5: Reposición Inter-Bodegas (Telares ➔ Formatex)</w:t>
       </w:r>
     </w:p>
     <w:p>
@@ -1374,17 +887,17 @@
           <w:rFonts w:ascii="Arial" w:hAnsi="Arial"/>
           <w:b/>
           <w:color w:val="1B365D"/>
-          <w:sz w:val="19"/>
+          <w:sz w:val="18"/>
         </w:rPr>
-        <w:t xml:space="preserve">Stock Disponible Formatex: </w:t>
+        <w:t xml:space="preserve">Frecuencia y Modalidades: </w:t>
       </w:r>
       <w:r>
         <w:rPr>
           <w:rFonts w:ascii="Arial" w:hAnsi="Arial"/>
           <w:color w:val="334155"/>
-          <w:sz w:val="19"/>
+          <w:sz w:val="18"/>
         </w:rPr>
-        <w:t>Rollos físicos en bodega Formatex para despacho inmediato.</w:t>
+        <w:t>Se efectúan entre 5 y 6 requisiciones semanales de Formatex a Telares. Al inicio de cada día se procesa un concentrado de pedidos de clientes y por la tarde se atienden traspasos exprés incluso por un solo rollo.</w:t>
       </w:r>
     </w:p>
     <w:p>
@@ -1397,17 +910,17 @@
           <w:rFonts w:ascii="Arial" w:hAnsi="Arial"/>
           <w:b/>
           <w:color w:val="1B365D"/>
-          <w:sz w:val="19"/>
+          <w:sz w:val="18"/>
         </w:rPr>
-        <w:t xml:space="preserve">Stock Disponible Telares (Rensselaer): </w:t>
+        <w:t xml:space="preserve">Regla Operativa en Telares: </w:t>
       </w:r>
       <w:r>
         <w:rPr>
           <w:rFonts w:ascii="Arial" w:hAnsi="Arial"/>
           <w:color w:val="334155"/>
-          <w:sz w:val="19"/>
+          <w:sz w:val="18"/>
         </w:rPr>
-        <w:t>Rollos en bodega matriz para entrega en 24 horas vía traspaso diario.</w:t>
+        <w:t>En Bodega Tototlán únicamente se despachan rollos enteros cerrados de 50 metros estándar. Telares nunca fracciona ni corta rollos.</w:t>
       </w:r>
     </w:p>
     <w:p>
@@ -1420,71 +933,40 @@
           <w:rFonts w:ascii="Arial" w:hAnsi="Arial"/>
           <w:b/>
           <w:color w:val="1B365D"/>
-          <w:sz w:val="19"/>
+          <w:sz w:val="18"/>
         </w:rPr>
-        <w:t xml:space="preserve">Stock en Tránsito Marítimo: </w:t>
+        <w:t xml:space="preserve">Digitalización del Formato de WhatsApp: </w:t>
       </w:r>
       <w:r>
         <w:rPr>
           <w:rFonts w:ascii="Arial" w:hAnsi="Arial"/>
           <w:color w:val="334155"/>
-          <w:sz w:val="19"/>
+          <w:sz w:val="18"/>
         </w:rPr>
-        <w:t>Rollos en buque con número de contenedor y fecha estimada de arribo (ETA).</w:t>
+        <w:t>Se reemplazan las notas informales de WhatsApp con Requisiciones Digitales en WMS (folio REQ-TNT-2026-XXXX), con generación de ficha para WhatsApp en un clic y Vale de Carga impreso para el chofer de la camioneta.</w:t>
       </w:r>
     </w:p>
     <w:p>
       <w:pPr>
-        <w:keepNext/>
-        <w:spacing w:before="160" w:after="60"/>
+        <w:pStyle w:val="ListBullet"/>
+        <w:spacing w:before="20" w:after="40"/>
       </w:pPr>
       <w:r>
         <w:rPr>
           <w:rFonts w:ascii="Arial" w:hAnsi="Arial"/>
           <w:b/>
-          <w:color w:val="0284C7"/>
-          <w:sz w:val="22"/>
+          <w:color w:val="1B365D"/>
+          <w:sz w:val="18"/>
         </w:rPr>
-        <w:t>8.2. Regla de Disponibilidad Neta</w:t>
+        <w:t xml:space="preserve">Ciclo de 3 Pasos de la Requisición: </w:t>
       </w:r>
-    </w:p>
-    <w:p>
-      <w:pPr>
-        <w:spacing w:before="0" w:after="80"/>
-      </w:pPr>
       <w:r>
         <w:rPr>
           <w:rFonts w:ascii="Arial" w:hAnsi="Arial"/>
           <w:color w:val="334155"/>
-          <w:sz w:val="19"/>
+          <w:sz w:val="18"/>
         </w:rPr>
-        <w:t>La cantidad ofrecible al cliente es calculada automáticamente por el sistema:</w:t>
-      </w:r>
-    </w:p>
-    <w:p>
-      <w:pPr>
-        <w:spacing w:before="0" w:after="80"/>
-      </w:pPr>
-      <w:r>
-        <w:rPr>
-          <w:rFonts w:ascii="Arial" w:hAnsi="Arial"/>
-          <w:color w:val="334155"/>
-          <w:sz w:val="19"/>
-        </w:rPr>
-        <w:t>Disponibilidad Neta = (Stock Físico TNT + Stock Físico Formatex + Tránsito) − (Apartados Activos 72h + Backorders FIFO)</w:t>
-      </w:r>
-    </w:p>
-    <w:p>
-      <w:pPr>
-        <w:spacing w:before="0" w:after="80"/>
-      </w:pPr>
-      <w:r>
-        <w:rPr>
-          <w:rFonts w:ascii="Arial" w:hAnsi="Arial"/>
-          <w:color w:val="334155"/>
-          <w:sz w:val="19"/>
-        </w:rPr>
-        <w:t>Queda prohibido ofrecer rollos que se encuentren comprometidos en apartados comerciales firmes o en la cola FIFO de otros clientes.</w:t>
+        <w:t>1. SOLICITADA (por Israel o Elba) ➔ 2. EN_RUTA_CAMIONETA (chofer cargó en Tototlán) ➔ 3. RECIBIDA_FORMATEX (Israel confirmó recepción física en Zapopan).</w:t>
       </w:r>
     </w:p>
     <w:p>
@@ -1497,22 +979,9 @@
           <w:rFonts w:ascii="Arial" w:hAnsi="Arial"/>
           <w:b/>
           <w:color w:val="1B365D"/>
-          <w:sz w:val="26"/>
+          <w:sz w:val="25"/>
         </w:rPr>
-        <w:t>9. Regla de Negocio 8: Trazabilidad Integral en Recepción (Lote - Proveedor - Embarque)</w:t>
-      </w:r>
-    </w:p>
-    <w:p>
-      <w:pPr>
-        <w:spacing w:before="0" w:after="80"/>
-      </w:pPr>
-      <w:r>
-        <w:rPr>
-          <w:rFonts w:ascii="Arial" w:hAnsi="Arial"/>
-          <w:color w:val="334155"/>
-          <w:sz w:val="19"/>
-        </w:rPr>
-        <w:t>Al registrar el ingreso de rollos textiles en el WMS, es mandatorio capturar:</w:t>
+        <w:t>7. Regla de Negocio 6: Facturación Inter-Compañía y Protección de Margen</w:t>
       </w:r>
     </w:p>
     <w:p>
@@ -1525,17 +994,17 @@
           <w:rFonts w:ascii="Arial" w:hAnsi="Arial"/>
           <w:b/>
           <w:color w:val="1B365D"/>
-          <w:sz w:val="19"/>
+          <w:sz w:val="18"/>
         </w:rPr>
-        <w:t xml:space="preserve">Lote de Fabricación: </w:t>
+        <w:t xml:space="preserve">Margen Inter-Empresa: </w:t>
       </w:r>
       <w:r>
         <w:rPr>
           <w:rFonts w:ascii="Arial" w:hAnsi="Arial"/>
           <w:color w:val="334155"/>
-          <w:sz w:val="19"/>
+          <w:sz w:val="18"/>
         </w:rPr>
-        <w:t>Código del lote textil emitido por la fábrica de origen.</w:t>
+        <w:t>Telares factura a Formatex con un margen autorizado de entre el 7% y el 12% sobre el costo puesto en México, o mediante el factor de transferencia inter-compañía formal FM = 0.88.</w:t>
       </w:r>
     </w:p>
     <w:p>
@@ -1548,17 +1017,86 @@
           <w:rFonts w:ascii="Arial" w:hAnsi="Arial"/>
           <w:b/>
           <w:color w:val="1B365D"/>
-          <w:sz w:val="19"/>
+          <w:sz w:val="18"/>
         </w:rPr>
-        <w:t xml:space="preserve">Proveedor de Origen: </w:t>
+        <w:t xml:space="preserve">Regla del Costo Más Alto: </w:t>
       </w:r>
       <w:r>
         <w:rPr>
           <w:rFonts w:ascii="Arial" w:hAnsi="Arial"/>
           <w:color w:val="334155"/>
-          <w:sz w:val="19"/>
+          <w:sz w:val="18"/>
         </w:rPr>
-        <w:t>Fabricante extranjero o nacional registrado en catálogo.</w:t>
+        <w:t>Si en bodega coinciden rollos de distintos embarques con costos de flete dispares, el sistema toma como base el costo del último embarque más alto recibido, protegiendo la rentabilidad del grupo textil.</w:t>
+      </w:r>
+    </w:p>
+    <w:p>
+      <w:pPr>
+        <w:keepNext/>
+        <w:spacing w:before="280" w:after="80"/>
+      </w:pPr>
+      <w:r>
+        <w:rPr>
+          <w:rFonts w:ascii="Arial" w:hAnsi="Arial"/>
+          <w:b/>
+          <w:color w:val="1B365D"/>
+          <w:sz w:val="25"/>
+        </w:rPr>
+        <w:t>8. Regla de Negocio 7: Integración con Atención al Cliente (ATC) y Disponibilidad 360°</w:t>
+      </w:r>
+    </w:p>
+    <w:p>
+      <w:pPr>
+        <w:spacing w:before="0" w:after="80"/>
+      </w:pPr>
+      <w:r>
+        <w:rPr>
+          <w:rFonts w:ascii="Arial" w:hAnsi="Arial"/>
+          <w:color w:val="334155"/>
+          <w:sz w:val="18"/>
+        </w:rPr>
+        <w:t>ATC cuenta con visibilidad unificada de tres niveles en DisponibilidadPage.tsx: Stock físico en Formatex Zapopan (inmediato), Stock en Telares Tototlán (disponible en 24h vía camioneta) y Contenedores en Tránsito Marítimo con semáforos preventivos.</w:t>
+      </w:r>
+    </w:p>
+    <w:p>
+      <w:pPr>
+        <w:spacing w:before="0" w:after="80"/>
+      </w:pPr>
+      <w:r>
+        <w:rPr>
+          <w:rFonts w:ascii="Arial" w:hAnsi="Arial"/>
+          <w:color w:val="334155"/>
+          <w:sz w:val="18"/>
+        </w:rPr>
+        <w:t>Disponibilidad Neta = (Físico Zapopan + Físico Tototlán + Tránsito Marítimo) - (Apartados Activos 24h/72h + Backorders FIFO comprometidos).</w:t>
+      </w:r>
+    </w:p>
+    <w:p>
+      <w:pPr>
+        <w:keepNext/>
+        <w:spacing w:before="280" w:after="80"/>
+      </w:pPr>
+      <w:r>
+        <w:rPr>
+          <w:rFonts w:ascii="Arial" w:hAnsi="Arial"/>
+          <w:b/>
+          <w:color w:val="1B365D"/>
+          <w:sz w:val="25"/>
+        </w:rPr>
+        <w:t>9. Regla de Negocio 8: Preparación Estratégica para Fase 2 (WMS en Telares)</w:t>
+      </w:r>
+    </w:p>
+    <w:p>
+      <w:pPr>
+        <w:spacing w:before="0" w:after="80"/>
+      </w:pPr>
+      <w:r>
+        <w:rPr>
+          <w:rFonts w:ascii="Arial" w:hAnsi="Arial"/>
+          <w:color w:val="334155"/>
+          <w:sz w:val="18"/>
+        </w:rPr>
+        <w:t>Con base en la directiva de Don Ricardo Pérez, el WMS 360+ queda arquitectónicamente listo para su despliegue en Telares y Tejidos como segunda fase:</w:t>
       </w:r>
     </w:p>
     <w:p>
@@ -1571,17 +1109,17 @@
           <w:rFonts w:ascii="Arial" w:hAnsi="Arial"/>
           <w:b/>
           <w:color w:val="1B365D"/>
-          <w:sz w:val="19"/>
+          <w:sz w:val="18"/>
         </w:rPr>
-        <w:t xml:space="preserve">Contenedor / Pedimento: </w:t>
+        <w:t xml:space="preserve">Base de Datos Multi-Bodega: </w:t>
       </w:r>
       <w:r>
         <w:rPr>
           <w:rFonts w:ascii="Arial" w:hAnsi="Arial"/>
           <w:color w:val="334155"/>
-          <w:sz w:val="19"/>
+          <w:sz w:val="18"/>
         </w:rPr>
-        <w:t>Vinculación al contenedor marítimo o pedimento aduanal correspondiente.</w:t>
+        <w:t>Prisma gestiona nativamente BOD-PRI (Formatex) y BOD-TNT (Telares Tototlán) en la misma instancia de Supabase PostgreSQL.</w:t>
       </w:r>
     </w:p>
     <w:p>
@@ -1594,17 +1132,17 @@
           <w:rFonts w:ascii="Arial" w:hAnsi="Arial"/>
           <w:b/>
           <w:color w:val="1B365D"/>
-          <w:sz w:val="19"/>
+          <w:sz w:val="18"/>
         </w:rPr>
-        <w:t xml:space="preserve">Graduación de Calidad: </w:t>
+        <w:t xml:space="preserve">WMS Slim para Telares: </w:t>
       </w:r>
       <w:r>
         <w:rPr>
           <w:rFonts w:ascii="Arial" w:hAnsi="Arial"/>
           <w:color w:val="334155"/>
-          <w:sz w:val="19"/>
+          <w:sz w:val="18"/>
         </w:rPr>
-        <w:t>Clasificación de rollo: Conforme (1a calidad), Segunda, Saldo o Muestrario.</w:t>
+        <w:t>En Telares la operación es mucho más ágil: se limita a recepción de contenedores completos, almacenamiento en pallets de alta densidad y despacho de traspasos a Formatex, sin mesa de corte ni retazos.</w:t>
       </w:r>
     </w:p>
     <w:p>
@@ -1617,9 +1155,9 @@
           <w:rFonts w:ascii="Arial" w:hAnsi="Arial"/>
           <w:b/>
           <w:color w:val="1B365D"/>
-          <w:sz w:val="26"/>
+          <w:sz w:val="25"/>
         </w:rPr>
-        <w:t>10. Matriz de Compromisos y Entregables (Checklist)</w:t>
+        <w:t>10. Matriz de Documentación Oficial Recibida y Estatus</w:t>
       </w:r>
     </w:p>
     <w:tbl>
@@ -1638,22 +1176,19 @@
           <w:tcPr>
             <w:tcW w:type="dxa" w:w="3120"/>
             <w:shd w:fill="1B365D"/>
-            <w:tcMar>
-              <w:top w:w="80" w:type="dxa"/>
-              <w:bottom w:w="80" w:type="dxa"/>
-              <w:left w:w="100" w:type="dxa"/>
-              <w:right w:w="100" w:type="dxa"/>
-            </w:tcMar>
           </w:tcPr>
           <w:p>
+            <w:pPr>
+              <w:spacing w:after="40"/>
+            </w:pPr>
             <w:r>
               <w:rPr>
                 <w:rFonts w:ascii="Arial" w:hAnsi="Arial"/>
                 <w:b/>
                 <w:color w:val="FFFFFF"/>
-                <w:sz w:val="18"/>
+                <w:sz w:val="17"/>
               </w:rPr>
-              <w:t>Responsable</w:t>
+              <w:t>Documento Oficial Recibido</w:t>
             </w:r>
           </w:p>
         </w:tc>
@@ -1661,22 +1196,19 @@
           <w:tcPr>
             <w:tcW w:type="dxa" w:w="3120"/>
             <w:shd w:fill="1B365D"/>
-            <w:tcMar>
-              <w:top w:w="80" w:type="dxa"/>
-              <w:bottom w:w="80" w:type="dxa"/>
-              <w:left w:w="100" w:type="dxa"/>
-              <w:right w:w="100" w:type="dxa"/>
-            </w:tcMar>
           </w:tcPr>
           <w:p>
+            <w:pPr>
+              <w:spacing w:after="40"/>
+            </w:pPr>
             <w:r>
               <w:rPr>
                 <w:rFonts w:ascii="Arial" w:hAnsi="Arial"/>
                 <w:b/>
                 <w:color w:val="FFFFFF"/>
-                <w:sz w:val="18"/>
+                <w:sz w:val="17"/>
               </w:rPr>
-              <w:t>Entregable / Acción Acordada</w:t>
+              <w:t>Descripción Técnica</w:t>
             </w:r>
           </w:p>
         </w:tc>
@@ -1684,22 +1216,98 @@
           <w:tcPr>
             <w:tcW w:type="dxa" w:w="3120"/>
             <w:shd w:fill="1B365D"/>
-            <w:tcMar>
-              <w:top w:w="80" w:type="dxa"/>
-              <w:bottom w:w="80" w:type="dxa"/>
-              <w:left w:w="100" w:type="dxa"/>
-              <w:right w:w="100" w:type="dxa"/>
-            </w:tcMar>
           </w:tcPr>
           <w:p>
+            <w:pPr>
+              <w:spacing w:after="40"/>
+            </w:pPr>
             <w:r>
               <w:rPr>
                 <w:rFonts w:ascii="Arial" w:hAnsi="Arial"/>
                 <w:b/>
                 <w:color w:val="FFFFFF"/>
-                <w:sz w:val="18"/>
+                <w:sz w:val="17"/>
               </w:rPr>
-              <w:t>Estatus</w:t>
+              <w:t>Estatus en WMS 360+</w:t>
+            </w:r>
+          </w:p>
+        </w:tc>
+      </w:tr>
+      <w:tr>
+        <w:tc>
+          <w:tcPr>
+            <w:tcW w:type="dxa" w:w="3120"/>
+            <w:shd w:fill="F8FAFC"/>
+            <w:tcMar>
+              <w:top w:w="40" w:type="dxa"/>
+              <w:bottom w:w="40" w:type="dxa"/>
+              <w:left w:w="60" w:type="dxa"/>
+              <w:right w:w="60" w:type="dxa"/>
+            </w:tcMar>
+          </w:tcPr>
+          <w:p>
+            <w:pPr>
+              <w:spacing w:after="20"/>
+            </w:pPr>
+            <w:r>
+              <w:rPr>
+                <w:rFonts w:ascii="Arial" w:hAnsi="Arial"/>
+                <w:b/>
+                <w:color w:val="1B365D"/>
+                <w:sz w:val="16"/>
+              </w:rPr>
+              <w:t>CALCULO DE COSTOS DE IMPORTACION (COSTEO).xlsx</w:t>
+            </w:r>
+          </w:p>
+        </w:tc>
+        <w:tc>
+          <w:tcPr>
+            <w:tcW w:type="dxa" w:w="3120"/>
+            <w:shd w:fill="F8FAFC"/>
+            <w:tcMar>
+              <w:top w:w="40" w:type="dxa"/>
+              <w:bottom w:w="40" w:type="dxa"/>
+              <w:left w:w="60" w:type="dxa"/>
+              <w:right w:w="60" w:type="dxa"/>
+            </w:tcMar>
+          </w:tcPr>
+          <w:p>
+            <w:pPr>
+              <w:spacing w:after="20"/>
+            </w:pPr>
+            <w:r>
+              <w:rPr>
+                <w:rFonts w:ascii="Arial" w:hAnsi="Arial"/>
+                <w:color w:val="334155"/>
+                <w:sz w:val="16"/>
+              </w:rPr>
+              <w:t>Fórmulas oficiales de Elba para costeo FOB, incremento 23% y landed cost</w:t>
+            </w:r>
+          </w:p>
+        </w:tc>
+        <w:tc>
+          <w:tcPr>
+            <w:tcW w:type="dxa" w:w="3120"/>
+            <w:shd w:fill="F8FAFC"/>
+            <w:tcMar>
+              <w:top w:w="40" w:type="dxa"/>
+              <w:bottom w:w="40" w:type="dxa"/>
+              <w:left w:w="60" w:type="dxa"/>
+              <w:right w:w="60" w:type="dxa"/>
+            </w:tcMar>
+          </w:tcPr>
+          <w:p>
+            <w:pPr>
+              <w:spacing w:after="20"/>
+            </w:pPr>
+            <w:r>
+              <w:rPr>
+                <w:rFonts w:ascii="Arial" w:hAnsi="Arial"/>
+                <w:b/>
+                <w:color w:val="10B981"/>
+                <w:sz w:val="16"/>
+              </w:rPr>
+              <w:t>Integrado en Módulo de Costeo</w:t>
             </w:r>
           </w:p>
         </w:tc>
@@ -1710,21 +1318,24 @@
             <w:tcW w:type="dxa" w:w="3120"/>
             <w:shd w:fill="FFFFFF"/>
             <w:tcMar>
-              <w:top w:w="60" w:type="dxa"/>
-              <w:bottom w:w="60" w:type="dxa"/>
-              <w:left w:w="80" w:type="dxa"/>
-              <w:right w:w="80" w:type="dxa"/>
+              <w:top w:w="40" w:type="dxa"/>
+              <w:bottom w:w="40" w:type="dxa"/>
+              <w:left w:w="60" w:type="dxa"/>
+              <w:right w:w="60" w:type="dxa"/>
             </w:tcMar>
           </w:tcPr>
           <w:p>
+            <w:pPr>
+              <w:spacing w:after="20"/>
+            </w:pPr>
             <w:r>
               <w:rPr>
                 <w:rFonts w:ascii="Arial" w:hAnsi="Arial"/>
                 <w:b/>
                 <w:color w:val="1B365D"/>
-                <w:sz w:val="17"/>
+                <w:sz w:val="16"/>
               </w:rPr>
-              <w:t>Elba / Mane</w:t>
+              <w:t>PEDIMENTO.pdf</w:t>
             </w:r>
           </w:p>
         </w:tc>
@@ -1733,20 +1344,23 @@
             <w:tcW w:type="dxa" w:w="3120"/>
             <w:shd w:fill="FFFFFF"/>
             <w:tcMar>
-              <w:top w:w="60" w:type="dxa"/>
-              <w:bottom w:w="60" w:type="dxa"/>
-              <w:left w:w="80" w:type="dxa"/>
-              <w:right w:w="80" w:type="dxa"/>
+              <w:top w:w="40" w:type="dxa"/>
+              <w:bottom w:w="40" w:type="dxa"/>
+              <w:left w:w="60" w:type="dxa"/>
+              <w:right w:w="60" w:type="dxa"/>
             </w:tcMar>
           </w:tcPr>
           <w:p>
+            <w:pPr>
+              <w:spacing w:after="20"/>
+            </w:pPr>
             <w:r>
               <w:rPr>
                 <w:rFonts w:ascii="Arial" w:hAnsi="Arial"/>
                 <w:color w:val="334155"/>
-                <w:sz w:val="17"/>
+                <w:sz w:val="16"/>
               </w:rPr>
-              <w:t>Compartir ejemplos de cálculo de costos (FOB, gastos incrementables y costo Landed en México)</w:t>
+              <w:t>Pedimento SAT oficial Aduana Manzanillo (18.3688 TC Oficial)</w:t>
             </w:r>
           </w:p>
         </w:tc>
@@ -1755,20 +1369,24 @@
             <w:tcW w:type="dxa" w:w="3120"/>
             <w:shd w:fill="FFFFFF"/>
             <w:tcMar>
-              <w:top w:w="60" w:type="dxa"/>
-              <w:bottom w:w="60" w:type="dxa"/>
-              <w:left w:w="80" w:type="dxa"/>
-              <w:right w:w="80" w:type="dxa"/>
+              <w:top w:w="40" w:type="dxa"/>
+              <w:bottom w:w="40" w:type="dxa"/>
+              <w:left w:w="60" w:type="dxa"/>
+              <w:right w:w="60" w:type="dxa"/>
             </w:tcMar>
           </w:tcPr>
           <w:p>
+            <w:pPr>
+              <w:spacing w:after="20"/>
+            </w:pPr>
             <w:r>
               <w:rPr>
                 <w:rFonts w:ascii="Arial" w:hAnsi="Arial"/>
-                <w:color w:val="334155"/>
-                <w:sz w:val="17"/>
+                <w:b/>
+                <w:color w:val="10B981"/>
+                <w:sz w:val="16"/>
               </w:rPr>
-              <w:t>Pendiente envío</w:t>
+              <w:t>Integrado en Campos SAT</w:t>
             </w:r>
           </w:p>
         </w:tc>
@@ -1779,21 +1397,24 @@
             <w:tcW w:type="dxa" w:w="3120"/>
             <w:shd w:fill="F8FAFC"/>
             <w:tcMar>
-              <w:top w:w="60" w:type="dxa"/>
-              <w:bottom w:w="60" w:type="dxa"/>
-              <w:left w:w="80" w:type="dxa"/>
-              <w:right w:w="80" w:type="dxa"/>
+              <w:top w:w="40" w:type="dxa"/>
+              <w:bottom w:w="40" w:type="dxa"/>
+              <w:left w:w="60" w:type="dxa"/>
+              <w:right w:w="60" w:type="dxa"/>
             </w:tcMar>
           </w:tcPr>
           <w:p>
+            <w:pPr>
+              <w:spacing w:after="20"/>
+            </w:pPr>
             <w:r>
               <w:rPr>
                 <w:rFonts w:ascii="Arial" w:hAnsi="Arial"/>
                 <w:b/>
                 <w:color w:val="1B365D"/>
-                <w:sz w:val="17"/>
+                <w:sz w:val="16"/>
               </w:rPr>
-              <w:t>Elba / Mane</w:t>
+              <w:t>ORDEN DE COMPRA FORMATEX A TELARES.pdf</w:t>
             </w:r>
           </w:p>
         </w:tc>
@@ -1802,20 +1423,23 @@
             <w:tcW w:type="dxa" w:w="3120"/>
             <w:shd w:fill="F8FAFC"/>
             <w:tcMar>
-              <w:top w:w="60" w:type="dxa"/>
-              <w:bottom w:w="60" w:type="dxa"/>
-              <w:left w:w="80" w:type="dxa"/>
-              <w:right w:w="80" w:type="dxa"/>
+              <w:top w:w="40" w:type="dxa"/>
+              <w:bottom w:w="40" w:type="dxa"/>
+              <w:left w:w="60" w:type="dxa"/>
+              <w:right w:w="60" w:type="dxa"/>
             </w:tcMar>
           </w:tcPr>
           <w:p>
+            <w:pPr>
+              <w:spacing w:after="20"/>
+            </w:pPr>
             <w:r>
               <w:rPr>
                 <w:rFonts w:ascii="Arial" w:hAnsi="Arial"/>
                 <w:color w:val="334155"/>
-                <w:sz w:val="17"/>
+                <w:sz w:val="16"/>
               </w:rPr>
-              <w:t>Compartir formato oficial de Órdenes de Compra a China y órdenes de pedido Formatex ↔ Telares</w:t>
+              <w:t>Formato histórico de solicitud inter-compañía</w:t>
             </w:r>
           </w:p>
         </w:tc>
@@ -1824,20 +1448,24 @@
             <w:tcW w:type="dxa" w:w="3120"/>
             <w:shd w:fill="F8FAFC"/>
             <w:tcMar>
-              <w:top w:w="60" w:type="dxa"/>
-              <w:bottom w:w="60" w:type="dxa"/>
-              <w:left w:w="80" w:type="dxa"/>
-              <w:right w:w="80" w:type="dxa"/>
+              <w:top w:w="40" w:type="dxa"/>
+              <w:bottom w:w="40" w:type="dxa"/>
+              <w:left w:w="60" w:type="dxa"/>
+              <w:right w:w="60" w:type="dxa"/>
             </w:tcMar>
           </w:tcPr>
           <w:p>
+            <w:pPr>
+              <w:spacing w:after="20"/>
+            </w:pPr>
             <w:r>
               <w:rPr>
                 <w:rFonts w:ascii="Arial" w:hAnsi="Arial"/>
-                <w:color w:val="334155"/>
-                <w:sz w:val="17"/>
+                <w:b/>
+                <w:color w:val="10B981"/>
+                <w:sz w:val="16"/>
               </w:rPr>
-              <w:t>Pendiente envío</w:t>
+              <w:t>Digitalizado en Requisiciones</w:t>
             </w:r>
           </w:p>
         </w:tc>
@@ -1848,21 +1476,24 @@
             <w:tcW w:type="dxa" w:w="3120"/>
             <w:shd w:fill="FFFFFF"/>
             <w:tcMar>
-              <w:top w:w="60" w:type="dxa"/>
-              <w:bottom w:w="60" w:type="dxa"/>
-              <w:left w:w="80" w:type="dxa"/>
-              <w:right w:w="80" w:type="dxa"/>
+              <w:top w:w="40" w:type="dxa"/>
+              <w:bottom w:w="40" w:type="dxa"/>
+              <w:left w:w="60" w:type="dxa"/>
+              <w:right w:w="60" w:type="dxa"/>
             </w:tcMar>
           </w:tcPr>
           <w:p>
+            <w:pPr>
+              <w:spacing w:after="20"/>
+            </w:pPr>
             <w:r>
               <w:rPr>
                 <w:rFonts w:ascii="Arial" w:hAnsi="Arial"/>
                 <w:b/>
                 <w:color w:val="1B365D"/>
-                <w:sz w:val="17"/>
+                <w:sz w:val="16"/>
               </w:rPr>
-              <w:t>Elba / Mane</w:t>
+              <w:t>EJEMPLO DE ORDEN DE COMPRA A PROVEEDOR.pdf</w:t>
             </w:r>
           </w:p>
         </w:tc>
@@ -1871,20 +1502,23 @@
             <w:tcW w:type="dxa" w:w="3120"/>
             <w:shd w:fill="FFFFFF"/>
             <w:tcMar>
-              <w:top w:w="60" w:type="dxa"/>
-              <w:bottom w:w="60" w:type="dxa"/>
-              <w:left w:w="80" w:type="dxa"/>
-              <w:right w:w="80" w:type="dxa"/>
+              <w:top w:w="40" w:type="dxa"/>
+              <w:bottom w:w="40" w:type="dxa"/>
+              <w:left w:w="60" w:type="dxa"/>
+              <w:right w:w="60" w:type="dxa"/>
             </w:tcMar>
           </w:tcPr>
           <w:p>
+            <w:pPr>
+              <w:spacing w:after="20"/>
+            </w:pPr>
             <w:r>
               <w:rPr>
                 <w:rFonts w:ascii="Arial" w:hAnsi="Arial"/>
                 <w:color w:val="334155"/>
-                <w:sz w:val="17"/>
+                <w:sz w:val="16"/>
               </w:rPr>
-              <w:t>Compartir catálogo actual con relación de códigos/nombres de China vs. nombres comerciales</w:t>
+              <w:t>Formato internacional de OC en USD para fábricas en China</w:t>
             </w:r>
           </w:p>
         </w:tc>
@@ -1893,20 +1527,24 @@
             <w:tcW w:type="dxa" w:w="3120"/>
             <w:shd w:fill="FFFFFF"/>
             <w:tcMar>
-              <w:top w:w="60" w:type="dxa"/>
-              <w:bottom w:w="60" w:type="dxa"/>
-              <w:left w:w="80" w:type="dxa"/>
-              <w:right w:w="80" w:type="dxa"/>
+              <w:top w:w="40" w:type="dxa"/>
+              <w:bottom w:w="40" w:type="dxa"/>
+              <w:left w:w="60" w:type="dxa"/>
+              <w:right w:w="60" w:type="dxa"/>
             </w:tcMar>
           </w:tcPr>
           <w:p>
+            <w:pPr>
+              <w:spacing w:after="20"/>
+            </w:pPr>
             <w:r>
               <w:rPr>
                 <w:rFonts w:ascii="Arial" w:hAnsi="Arial"/>
-                <w:color w:val="334155"/>
-                <w:sz w:val="17"/>
+                <w:b/>
+                <w:color w:val="10B981"/>
+                <w:sz w:val="16"/>
               </w:rPr>
-              <w:t>Pendiente envío</w:t>
+              <w:t>Integrado en Nueva OC China</w:t>
             </w:r>
           </w:p>
         </w:tc>
@@ -1917,21 +1555,24 @@
             <w:tcW w:type="dxa" w:w="3120"/>
             <w:shd w:fill="F8FAFC"/>
             <w:tcMar>
-              <w:top w:w="60" w:type="dxa"/>
-              <w:bottom w:w="60" w:type="dxa"/>
-              <w:left w:w="80" w:type="dxa"/>
-              <w:right w:w="80" w:type="dxa"/>
+              <w:top w:w="40" w:type="dxa"/>
+              <w:bottom w:w="40" w:type="dxa"/>
+              <w:left w:w="60" w:type="dxa"/>
+              <w:right w:w="60" w:type="dxa"/>
             </w:tcMar>
           </w:tcPr>
           <w:p>
+            <w:pPr>
+              <w:spacing w:after="20"/>
+            </w:pPr>
             <w:r>
               <w:rPr>
                 <w:rFonts w:ascii="Arial" w:hAnsi="Arial"/>
                 <w:b/>
                 <w:color w:val="1B365D"/>
-                <w:sz w:val="17"/>
+                <w:sz w:val="16"/>
               </w:rPr>
-              <w:t>Elba / Mane</w:t>
+              <w:t>CATALOGO DE PRODUCTOS.xlsx</w:t>
             </w:r>
           </w:p>
         </w:tc>
@@ -1940,20 +1581,23 @@
             <w:tcW w:type="dxa" w:w="3120"/>
             <w:shd w:fill="F8FAFC"/>
             <w:tcMar>
-              <w:top w:w="60" w:type="dxa"/>
-              <w:bottom w:w="60" w:type="dxa"/>
-              <w:left w:w="80" w:type="dxa"/>
-              <w:right w:w="80" w:type="dxa"/>
+              <w:top w:w="40" w:type="dxa"/>
+              <w:bottom w:w="40" w:type="dxa"/>
+              <w:left w:w="60" w:type="dxa"/>
+              <w:right w:w="60" w:type="dxa"/>
             </w:tcMar>
           </w:tcPr>
           <w:p>
+            <w:pPr>
+              <w:spacing w:after="20"/>
+            </w:pPr>
             <w:r>
               <w:rPr>
                 <w:rFonts w:ascii="Arial" w:hAnsi="Arial"/>
                 <w:color w:val="334155"/>
-                <w:sz w:val="17"/>
+                <w:sz w:val="16"/>
               </w:rPr>
-              <w:t>Compartir capturas de pantalla de la estructura actual en CONTPAQi Comercial (módulo compras y costos)</w:t>
+              <w:t>1,499 SKUs de tela con especificaciones técnicas</w:t>
             </w:r>
           </w:p>
         </w:tc>
@@ -1962,20 +1606,24 @@
             <w:tcW w:type="dxa" w:w="3120"/>
             <w:shd w:fill="F8FAFC"/>
             <w:tcMar>
-              <w:top w:w="60" w:type="dxa"/>
-              <w:bottom w:w="60" w:type="dxa"/>
-              <w:left w:w="80" w:type="dxa"/>
-              <w:right w:w="80" w:type="dxa"/>
+              <w:top w:w="40" w:type="dxa"/>
+              <w:bottom w:w="40" w:type="dxa"/>
+              <w:left w:w="60" w:type="dxa"/>
+              <w:right w:w="60" w:type="dxa"/>
             </w:tcMar>
           </w:tcPr>
           <w:p>
+            <w:pPr>
+              <w:spacing w:after="20"/>
+            </w:pPr>
             <w:r>
               <w:rPr>
                 <w:rFonts w:ascii="Arial" w:hAnsi="Arial"/>
-                <w:color w:val="334155"/>
-                <w:sz w:val="17"/>
+                <w:b/>
+                <w:color w:val="10B981"/>
+                <w:sz w:val="16"/>
               </w:rPr>
-              <w:t>Pendiente envío</w:t>
+              <w:t>Ingestado en SkuMaster</w:t>
             </w:r>
           </w:p>
         </w:tc>
@@ -1986,21 +1634,24 @@
             <w:tcW w:type="dxa" w:w="3120"/>
             <w:shd w:fill="FFFFFF"/>
             <w:tcMar>
-              <w:top w:w="60" w:type="dxa"/>
-              <w:bottom w:w="60" w:type="dxa"/>
-              <w:left w:w="80" w:type="dxa"/>
-              <w:right w:w="80" w:type="dxa"/>
+              <w:top w:w="40" w:type="dxa"/>
+              <w:bottom w:w="40" w:type="dxa"/>
+              <w:left w:w="60" w:type="dxa"/>
+              <w:right w:w="60" w:type="dxa"/>
             </w:tcMar>
           </w:tcPr>
           <w:p>
+            <w:pPr>
+              <w:spacing w:after="20"/>
+            </w:pPr>
             <w:r>
               <w:rPr>
                 <w:rFonts w:ascii="Arial" w:hAnsi="Arial"/>
                 <w:b/>
                 <w:color w:val="1B365D"/>
-                <w:sz w:val="17"/>
+                <w:sz w:val="16"/>
               </w:rPr>
-              <w:t>Movida TCI</w:t>
+              <w:t>MASTER 19 DE OCTUBRE 2026.xlsx</w:t>
             </w:r>
           </w:p>
         </w:tc>
@@ -2009,20 +1660,23 @@
             <w:tcW w:type="dxa" w:w="3120"/>
             <w:shd w:fill="FFFFFF"/>
             <w:tcMar>
-              <w:top w:w="60" w:type="dxa"/>
-              <w:bottom w:w="60" w:type="dxa"/>
-              <w:left w:w="80" w:type="dxa"/>
-              <w:right w:w="80" w:type="dxa"/>
+              <w:top w:w="40" w:type="dxa"/>
+              <w:bottom w:w="40" w:type="dxa"/>
+              <w:left w:w="60" w:type="dxa"/>
+              <w:right w:w="60" w:type="dxa"/>
             </w:tcMar>
           </w:tcPr>
           <w:p>
+            <w:pPr>
+              <w:spacing w:after="20"/>
+            </w:pPr>
             <w:r>
               <w:rPr>
                 <w:rFonts w:ascii="Arial" w:hAnsi="Arial"/>
                 <w:color w:val="334155"/>
-                <w:sz w:val="17"/>
+                <w:sz w:val="16"/>
               </w:rPr>
-              <w:t>Entrega de documento oficial de especificación y reglas de negocio para revisión y firma</w:t>
+              <w:t>Relación de stock físico y tránsitos marítimos</w:t>
             </w:r>
           </w:p>
         </w:tc>
@@ -2031,21 +1685,24 @@
             <w:tcW w:type="dxa" w:w="3120"/>
             <w:shd w:fill="FFFFFF"/>
             <w:tcMar>
-              <w:top w:w="60" w:type="dxa"/>
-              <w:bottom w:w="60" w:type="dxa"/>
-              <w:left w:w="80" w:type="dxa"/>
-              <w:right w:w="80" w:type="dxa"/>
+              <w:top w:w="40" w:type="dxa"/>
+              <w:bottom w:w="40" w:type="dxa"/>
+              <w:left w:w="60" w:type="dxa"/>
+              <w:right w:w="60" w:type="dxa"/>
             </w:tcMar>
           </w:tcPr>
           <w:p>
+            <w:pPr>
+              <w:spacing w:after="20"/>
+            </w:pPr>
             <w:r>
               <w:rPr>
                 <w:rFonts w:ascii="Arial" w:hAnsi="Arial"/>
                 <w:b/>
                 <w:color w:val="10B981"/>
-                <w:sz w:val="17"/>
+                <w:sz w:val="16"/>
               </w:rPr>
-              <w:t>COMPLETADO</w:t>
+              <w:t>Ingestado en Base de Datos</w:t>
             </w:r>
           </w:p>
         </w:tc>
@@ -2056,21 +1713,24 @@
             <w:tcW w:type="dxa" w:w="3120"/>
             <w:shd w:fill="F8FAFC"/>
             <w:tcMar>
-              <w:top w:w="60" w:type="dxa"/>
-              <w:bottom w:w="60" w:type="dxa"/>
-              <w:left w:w="80" w:type="dxa"/>
-              <w:right w:w="80" w:type="dxa"/>
+              <w:top w:w="40" w:type="dxa"/>
+              <w:bottom w:w="40" w:type="dxa"/>
+              <w:left w:w="60" w:type="dxa"/>
+              <w:right w:w="60" w:type="dxa"/>
             </w:tcMar>
           </w:tcPr>
           <w:p>
+            <w:pPr>
+              <w:spacing w:after="20"/>
+            </w:pPr>
             <w:r>
               <w:rPr>
                 <w:rFonts w:ascii="Arial" w:hAnsi="Arial"/>
                 <w:b/>
                 <w:color w:val="1B365D"/>
-                <w:sz w:val="17"/>
+                <w:sz w:val="16"/>
               </w:rPr>
-              <w:t>Movida TCI &amp; Israel</w:t>
+              <w:t>FORMATO DE HOJA ELECTRONICA.xlsx</w:t>
             </w:r>
           </w:p>
         </w:tc>
@@ -2079,20 +1739,23 @@
             <w:tcW w:type="dxa" w:w="3120"/>
             <w:shd w:fill="F8FAFC"/>
             <w:tcMar>
-              <w:top w:w="60" w:type="dxa"/>
-              <w:bottom w:w="60" w:type="dxa"/>
-              <w:left w:w="80" w:type="dxa"/>
-              <w:right w:w="80" w:type="dxa"/>
+              <w:top w:w="40" w:type="dxa"/>
+              <w:bottom w:w="40" w:type="dxa"/>
+              <w:left w:w="60" w:type="dxa"/>
+              <w:right w:w="60" w:type="dxa"/>
             </w:tcMar>
           </w:tcPr>
           <w:p>
+            <w:pPr>
+              <w:spacing w:after="20"/>
+            </w:pPr>
             <w:r>
               <w:rPr>
                 <w:rFonts w:ascii="Arial" w:hAnsi="Arial"/>
                 <w:color w:val="334155"/>
-                <w:sz w:val="17"/>
+                <w:sz w:val="16"/>
               </w:rPr>
-              <w:t>Agendar sesión técnica con Israel (Almacén) para afinar el flujo de transferencia física inter-bodegas</w:t>
+              <w:t>Formato de captura contable CONTPAQi Comercial</w:t>
             </w:r>
           </w:p>
         </w:tc>
@@ -2101,94 +1764,34 @@
             <w:tcW w:type="dxa" w:w="3120"/>
             <w:shd w:fill="F8FAFC"/>
             <w:tcMar>
-              <w:top w:w="60" w:type="dxa"/>
-              <w:bottom w:w="60" w:type="dxa"/>
-              <w:left w:w="80" w:type="dxa"/>
-              <w:right w:w="80" w:type="dxa"/>
+              <w:top w:w="40" w:type="dxa"/>
+              <w:bottom w:w="40" w:type="dxa"/>
+              <w:left w:w="60" w:type="dxa"/>
+              <w:right w:w="60" w:type="dxa"/>
             </w:tcMar>
           </w:tcPr>
           <w:p>
-            <w:r>
-              <w:rPr>
-                <w:rFonts w:ascii="Arial" w:hAnsi="Arial"/>
-                <w:color w:val="334155"/>
-                <w:sz w:val="17"/>
-              </w:rPr>
-              <w:t>Por agendar</w:t>
-            </w:r>
-          </w:p>
-        </w:tc>
-      </w:tr>
-      <w:tr>
-        <w:tc>
-          <w:tcPr>
-            <w:tcW w:type="dxa" w:w="3120"/>
-            <w:shd w:fill="FFFFFF"/>
-            <w:tcMar>
-              <w:top w:w="60" w:type="dxa"/>
-              <w:bottom w:w="60" w:type="dxa"/>
-              <w:left w:w="80" w:type="dxa"/>
-              <w:right w:w="80" w:type="dxa"/>
-            </w:tcMar>
-          </w:tcPr>
-          <w:p>
+            <w:pPr>
+              <w:spacing w:after="20"/>
+            </w:pPr>
             <w:r>
               <w:rPr>
                 <w:rFonts w:ascii="Arial" w:hAnsi="Arial"/>
                 <w:b/>
-                <w:color w:val="1B365D"/>
-                <w:sz w:val="17"/>
+                <w:color w:val="10B981"/>
+                <w:sz w:val="16"/>
               </w:rPr>
-              <w:t>Equipo Conjunto</w:t>
-            </w:r>
-          </w:p>
-        </w:tc>
-        <w:tc>
-          <w:tcPr>
-            <w:tcW w:type="dxa" w:w="3120"/>
-            <w:shd w:fill="FFFFFF"/>
-            <w:tcMar>
-              <w:top w:w="60" w:type="dxa"/>
-              <w:bottom w:w="60" w:type="dxa"/>
-              <w:left w:w="80" w:type="dxa"/>
-              <w:right w:w="80" w:type="dxa"/>
-            </w:tcMar>
-          </w:tcPr>
-          <w:p>
-            <w:r>
-              <w:rPr>
-                <w:rFonts w:ascii="Arial" w:hAnsi="Arial"/>
-                <w:color w:val="334155"/>
-                <w:sz w:val="17"/>
-              </w:rPr>
-              <w:t>Agendar Sesión 2 para revisión a profundidad del Archivo Máster de Formatex</w:t>
-            </w:r>
-          </w:p>
-        </w:tc>
-        <w:tc>
-          <w:tcPr>
-            <w:tcW w:type="dxa" w:w="3120"/>
-            <w:shd w:fill="FFFFFF"/>
-            <w:tcMar>
-              <w:top w:w="60" w:type="dxa"/>
-              <w:bottom w:w="60" w:type="dxa"/>
-              <w:left w:w="80" w:type="dxa"/>
-              <w:right w:w="80" w:type="dxa"/>
-            </w:tcMar>
-          </w:tcPr>
-          <w:p>
-            <w:r>
-              <w:rPr>
-                <w:rFonts w:ascii="Arial" w:hAnsi="Arial"/>
-                <w:color w:val="334155"/>
-                <w:sz w:val="17"/>
-              </w:rPr>
-              <w:t>Por agendar</w:t>
+              <w:t>Soportado en Exportación</w:t>
             </w:r>
           </w:p>
         </w:tc>
       </w:tr>
     </w:tbl>
+    <w:p>
+      <w:pPr>
+        <w:spacing w:after="160"/>
+      </w:pPr>
+    </w:p>
     <w:p>
       <w:pPr>
         <w:keepNext/>
@@ -2199,7 +1802,7 @@
           <w:rFonts w:ascii="Arial" w:hAnsi="Arial"/>
           <w:b/>
           <w:color w:val="1B365D"/>
-          <w:sz w:val="26"/>
+          <w:sz w:val="25"/>
         </w:rPr>
         <w:t>11. Formalización y Firmas de Conformidad</w:t>
       </w:r>
@@ -2212,14 +1815,14 @@
         <w:rPr>
           <w:rFonts w:ascii="Arial" w:hAnsi="Arial"/>
           <w:color w:val="334155"/>
-          <w:sz w:val="19"/>
+          <w:sz w:val="18"/>
         </w:rPr>
         <w:t>Al firmar el presente documento, las partes manifiestan su plena conformidad con los requerimientos, criterios de costeo, reglas inter-compañía y flujos operativos aquí descritos, reconociéndolos como el marco oficial de desarrollo y control de cambios para el módulo de Compras e Importaciones del WMS 360+ Formatex:</w:t>
       </w:r>
     </w:p>
     <w:p>
       <w:pPr>
-        <w:spacing w:after="240"/>
+        <w:spacing w:after="160"/>
       </w:pPr>
     </w:p>
     <w:tbl>
@@ -2256,9 +1859,9 @@
               </w:rPr>
               <w:t>_________________________________________</w:t>
               <w:br/>
-              <w:t>Elba</w:t>
+              <w:t>Elba Vázquez</w:t>
               <w:br/>
-              <w:t>Compras e Importaciones</w:t>
+              <w:t>Jefa de Compras &amp; Costeo de Importación</w:t>
               <w:br/>
               <w:t>Telares y Tejidos / Formatex</w:t>
               <w:br/>
@@ -2289,9 +1892,9 @@
               </w:rPr>
               <w:t>_________________________________________</w:t>
               <w:br/>
-              <w:t>Mane</w:t>
+              <w:t>Mane Gómez</w:t>
               <w:br/>
-              <w:t>Especialista en Importaciones</w:t>
+              <w:t>Importaciones &amp; Tráfico Aduanal</w:t>
               <w:br/>
               <w:t>Telares y Tejidos S.A. de C.V.</w:t>
               <w:br/>
@@ -2407,11 +2010,11 @@
               </w:rPr>
               <w:t>_________________________________________</w:t>
               <w:br/>
-              <w:t>Ricardo Zerpa</w:t>
+              <w:t>Israel</w:t>
               <w:br/>
-              <w:t>Arquitectura de Producto &amp; Procesos</w:t>
+              <w:t>Jefe de Almacén &amp; Logística</w:t>
               <w:br/>
-              <w:t>Movida TCI LLC</w:t>
+              <w:t>Forma Textil S. de R.L. de C.V.</w:t>
               <w:br/>
               <w:t>Fecha: _____ / _____ / 2026</w:t>
             </w:r>
@@ -2492,11 +2095,11 @@
               </w:rPr>
               <w:t>_________________________________________</w:t>
               <w:br/>
-              <w:t>Jonathan Palacios</w:t>
+              <w:t>Don Ricardo Pérez</w:t>
               <w:br/>
-              <w:t>Dirección Técnica &amp; Desarrollo WMS</w:t>
+              <w:t>Director General &amp; Propietario</w:t>
               <w:br/>
-              <w:t>Movida TCI LLC</w:t>
+              <w:t>Formatex &amp; Telares y Tejidos</w:t>
               <w:br/>
               <w:t>Fecha: _____ / _____ / 2026</w:t>
             </w:r>
@@ -2523,6 +2126,15 @@
                 <w:color w:val="334155"/>
                 <w:sz w:val="17"/>
               </w:rPr>
+              <w:t>_________________________________________</w:t>
+              <w:br/>
+              <w:t>Jonathan Palacios</w:t>
+              <w:br/>
+              <w:t>Dirección Técnica &amp; Desarrollo WMS</w:t>
+              <w:br/>
+              <w:t>Movida TCI LLC</w:t>
+              <w:br/>
+              <w:t>Fecha: _____ / _____ / 2026</w:t>
             </w:r>
           </w:p>
         </w:tc>

</xml_diff>